<commit_message>
(fix): fixed column and dimension names
</commit_message>
<xml_diff>
--- a/dwh_design/Business_Template.docx
+++ b/dwh_design/Business_Template.docx
@@ -1829,21 +1829,7 @@
           <w:rFonts w:eastAsiaTheme="minorEastAsia" w:cstheme="minorBidi"/>
           <w:szCs w:val="32"/>
         </w:rPr>
-        <w:t>in the part 1.4 describe separated entities (dimension in the future) for both datasets (min 5 per each dataset)</w:t>
-      </w:r>
-      <w:r>
-        <w:rPr>
-          <w:rFonts w:eastAsiaTheme="minorEastAsia" w:cstheme="minorBidi"/>
-          <w:szCs w:val="32"/>
-        </w:rPr>
-        <w:t xml:space="preserve">, </w:t>
-      </w:r>
-      <w:r>
-        <w:rPr>
-          <w:rFonts w:eastAsiaTheme="minorEastAsia" w:cstheme="minorBidi"/>
-          <w:szCs w:val="32"/>
-        </w:rPr>
-        <w:t>describe differences between 2 datasets</w:t>
+        <w:t>in the part 1.4 describe separated entities (dimension in the future) for both datasets (min 5 per each dataset), describe differences between 2 datasets</w:t>
       </w:r>
     </w:p>
     <w:p>
@@ -5084,22 +5070,20 @@
           <w:b/>
           <w:bCs/>
         </w:rPr>
-        <w:t>Dim D</w:t>
-      </w:r>
-      <w:r>
-        <w:rPr>
-          <w:b/>
-          <w:bCs/>
-        </w:rPr>
-        <w:t>ate</w:t>
-      </w:r>
-    </w:p>
-    <w:p>
-      <w:pPr>
-        <w:pStyle w:val="BodyText"/>
-      </w:pPr>
-      <w:r>
-        <w:t>&lt;description&gt;</w:t>
+        <w:t>DIM_DATES</w:t>
+      </w:r>
+    </w:p>
+    <w:p>
+      <w:pPr>
+        <w:pStyle w:val="BodyText"/>
+      </w:pPr>
+      <w:proofErr w:type="gramStart"/>
+      <w:r>
+        <w:t>Provides</w:t>
+      </w:r>
+      <w:proofErr w:type="gramEnd"/>
+      <w:r>
+        <w:t xml:space="preserve"> detailed information about dates.</w:t>
       </w:r>
     </w:p>
     <w:p>
@@ -5233,11 +5217,9 @@
             <w:pPr>
               <w:pStyle w:val="BodyText"/>
             </w:pPr>
-            <w:proofErr w:type="spellStart"/>
-            <w:r>
-              <w:t>Date_key</w:t>
-            </w:r>
-            <w:proofErr w:type="spellEnd"/>
+            <w:r>
+              <w:t>DATE_ID</w:t>
+            </w:r>
           </w:p>
         </w:tc>
         <w:tc>
@@ -5280,7 +5262,7 @@
               <w:pStyle w:val="BodyText"/>
             </w:pPr>
             <w:r>
-              <w:t>Full date</w:t>
+              <w:t>FULL_DATE</w:t>
             </w:r>
           </w:p>
         </w:tc>
@@ -5323,11 +5305,9 @@
             <w:pPr>
               <w:pStyle w:val="BodyText"/>
             </w:pPr>
-            <w:proofErr w:type="spellStart"/>
-            <w:r>
-              <w:t>DayOfWeek_number</w:t>
-            </w:r>
-            <w:proofErr w:type="spellEnd"/>
+            <w:r>
+              <w:t>DAY_OF_THE_WEEK_NUMBER</w:t>
+            </w:r>
           </w:p>
         </w:tc>
         <w:tc>
@@ -5377,11 +5357,9 @@
             <w:pPr>
               <w:pStyle w:val="BodyText"/>
             </w:pPr>
-            <w:proofErr w:type="spellStart"/>
-            <w:r>
-              <w:t>DayOfWeek_desc</w:t>
-            </w:r>
-            <w:proofErr w:type="spellEnd"/>
+            <w:r>
+              <w:t>DEY_OF_THE_WEEK_DESC</w:t>
+            </w:r>
           </w:p>
         </w:tc>
         <w:tc>
@@ -5428,11 +5406,9 @@
             <w:pPr>
               <w:pStyle w:val="BodyText"/>
             </w:pPr>
-            <w:proofErr w:type="spellStart"/>
-            <w:r>
-              <w:t>Weekend_flag</w:t>
-            </w:r>
-            <w:proofErr w:type="spellEnd"/>
+            <w:r>
+              <w:t>IS_WEEKEND</w:t>
+            </w:r>
           </w:p>
         </w:tc>
         <w:tc>
@@ -5475,7 +5451,7 @@
               <w:pStyle w:val="BodyText"/>
             </w:pPr>
             <w:r>
-              <w:t>Day of month number</w:t>
+              <w:t>DAY_OF_THE_MONTH_NUMBER</w:t>
             </w:r>
           </w:p>
         </w:tc>
@@ -5519,7 +5495,7 @@
               <w:pStyle w:val="BodyText"/>
             </w:pPr>
             <w:r>
-              <w:t>Week number</w:t>
+              <w:t>WEEK_NUMBER</w:t>
             </w:r>
           </w:p>
         </w:tc>
@@ -5563,7 +5539,7 @@
               <w:pStyle w:val="BodyText"/>
             </w:pPr>
             <w:r>
-              <w:t>Month value</w:t>
+              <w:t>MONTH_NUMBER</w:t>
             </w:r>
           </w:p>
         </w:tc>
@@ -5612,7 +5588,10 @@
               <w:pStyle w:val="BodyText"/>
             </w:pPr>
             <w:r>
-              <w:t>Month desc</w:t>
+              <w:t>M</w:t>
+            </w:r>
+            <w:r>
+              <w:t>ONTH_DESC</w:t>
             </w:r>
           </w:p>
         </w:tc>
@@ -5661,7 +5640,10 @@
               <w:pStyle w:val="BodyText"/>
             </w:pPr>
             <w:r>
-              <w:t>Quarter value</w:t>
+              <w:t>Q</w:t>
+            </w:r>
+            <w:r>
+              <w:t>UARTER_NUMBER</w:t>
             </w:r>
           </w:p>
         </w:tc>
@@ -5710,7 +5692,7 @@
               <w:pStyle w:val="BodyText"/>
             </w:pPr>
             <w:r>
-              <w:t>Year value</w:t>
+              <w:t>YEAR_NUMBER</w:t>
             </w:r>
           </w:p>
         </w:tc>
@@ -5765,32 +5747,36 @@
           <w:b/>
           <w:bCs/>
         </w:rPr>
-        <w:t xml:space="preserve">Dim </w:t>
-      </w:r>
-      <w:r>
-        <w:rPr>
-          <w:b/>
-          <w:bCs/>
-        </w:rPr>
-        <w:t>Customer</w:t>
-      </w:r>
-    </w:p>
-    <w:p>
-      <w:pPr>
-        <w:pStyle w:val="BodyText"/>
-      </w:pPr>
-      <w:r>
-        <w:t>&lt;description&gt;</w:t>
-      </w:r>
-      <w:r>
-        <w:rPr>
-          <w:b/>
-          <w:bCs/>
-        </w:rPr>
-        <w:t>Sensitive fields excluded from DWH (PII/security):</w:t>
-      </w:r>
-      <w:r>
-        <w:t xml:space="preserve"> SSN, credit card number, CVV, IBAN, card expiration date</w:t>
+        <w:t>D</w:t>
+      </w:r>
+      <w:r>
+        <w:rPr>
+          <w:b/>
+          <w:bCs/>
+        </w:rPr>
+        <w:t>IM_CUSTOMERS</w:t>
+      </w:r>
+    </w:p>
+    <w:p>
+      <w:pPr>
+        <w:pStyle w:val="BodyText"/>
+        <w:rPr>
+          <w:b/>
+          <w:bCs/>
+        </w:rPr>
+      </w:pPr>
+      <w:r>
+        <w:t xml:space="preserve">Provides detailed information about customers. </w:t>
+      </w:r>
+      <w:r>
+        <w:rPr>
+          <w:b/>
+          <w:bCs/>
+        </w:rPr>
+        <w:t xml:space="preserve">Sensitive fields excluded </w:t>
+      </w:r>
+      <w:r>
+        <w:t>SSN, credit card number, CVV, IBAN, card expiration date</w:t>
       </w:r>
       <w:r>
         <w:t xml:space="preserve"> – not necessary for analysis.</w:t>
@@ -5929,7 +5915,10 @@
             </w:pPr>
             <w:r>
               <w:lastRenderedPageBreak/>
-              <w:t>Customer key</w:t>
+              <w:t>C</w:t>
+            </w:r>
+            <w:r>
+              <w:t>USTOMER_ID</w:t>
             </w:r>
           </w:p>
         </w:tc>
@@ -5973,7 +5962,7 @@
               <w:pStyle w:val="BodyText"/>
             </w:pPr>
             <w:r>
-              <w:t>Customer id</w:t>
+              <w:t>CUSTOMER_SRC_ID</w:t>
             </w:r>
           </w:p>
         </w:tc>
@@ -6022,7 +6011,10 @@
               <w:pStyle w:val="BodyText"/>
             </w:pPr>
             <w:r>
-              <w:t>Customer name</w:t>
+              <w:t>C</w:t>
+            </w:r>
+            <w:r>
+              <w:t>USTOMER_NAME</w:t>
             </w:r>
           </w:p>
         </w:tc>
@@ -6071,7 +6063,10 @@
               <w:pStyle w:val="BodyText"/>
             </w:pPr>
             <w:r>
-              <w:t>Customer gender</w:t>
+              <w:t>C</w:t>
+            </w:r>
+            <w:r>
+              <w:t>USTOMER_GENDER</w:t>
             </w:r>
           </w:p>
         </w:tc>
@@ -6120,7 +6115,10 @@
               <w:pStyle w:val="BodyText"/>
             </w:pPr>
             <w:r>
-              <w:t>Customer age</w:t>
+              <w:t>C</w:t>
+            </w:r>
+            <w:r>
+              <w:t>USTOMER_AGE</w:t>
             </w:r>
           </w:p>
         </w:tc>
@@ -6164,7 +6162,10 @@
               <w:pStyle w:val="BodyText"/>
             </w:pPr>
             <w:r>
-              <w:t>Customer email</w:t>
+              <w:t>C</w:t>
+            </w:r>
+            <w:r>
+              <w:t>USTOMER_EMAIL</w:t>
             </w:r>
           </w:p>
         </w:tc>
@@ -6213,7 +6214,10 @@
               <w:pStyle w:val="BodyText"/>
             </w:pPr>
             <w:r>
-              <w:t>Customer phone number</w:t>
+              <w:t>C</w:t>
+            </w:r>
+            <w:r>
+              <w:t>USTOMER_PHONE_NUMBER</w:t>
             </w:r>
           </w:p>
         </w:tc>
@@ -6262,7 +6266,10 @@
               <w:pStyle w:val="BodyText"/>
             </w:pPr>
             <w:r>
-              <w:t>Customer address</w:t>
+              <w:t>C</w:t>
+            </w:r>
+            <w:r>
+              <w:t>USTOMER_ADDRESS</w:t>
             </w:r>
           </w:p>
         </w:tc>
@@ -6311,7 +6318,7 @@
               <w:pStyle w:val="BodyText"/>
             </w:pPr>
             <w:r>
-              <w:t>Customer city</w:t>
+              <w:t>CUSTOMER_CITY</w:t>
             </w:r>
           </w:p>
         </w:tc>
@@ -6360,7 +6367,10 @@
               <w:pStyle w:val="BodyText"/>
             </w:pPr>
             <w:r>
-              <w:t>Customer state</w:t>
+              <w:t>C</w:t>
+            </w:r>
+            <w:r>
+              <w:t>USTOMER_STATE</w:t>
             </w:r>
           </w:p>
         </w:tc>
@@ -6409,7 +6419,10 @@
               <w:pStyle w:val="BodyText"/>
             </w:pPr>
             <w:r>
-              <w:t>Customer postal code</w:t>
+              <w:t>C</w:t>
+            </w:r>
+            <w:r>
+              <w:t>USTOMER_POSTAL_CODE</w:t>
             </w:r>
           </w:p>
         </w:tc>
@@ -6467,48 +6480,42 @@
           <w:b/>
           <w:bCs/>
         </w:rPr>
-        <w:t xml:space="preserve">Dim </w:t>
-      </w:r>
-      <w:r>
-        <w:rPr>
-          <w:b/>
-          <w:bCs/>
-        </w:rPr>
-        <w:t>Employee</w:t>
-      </w:r>
-    </w:p>
-    <w:p>
-      <w:pPr>
-        <w:pStyle w:val="BodyText"/>
-      </w:pPr>
-      <w:r>
-        <w:t>&lt;description&gt;</w:t>
-      </w:r>
-      <w:r>
-        <w:rPr>
-          <w:b/>
-          <w:bCs/>
-        </w:rPr>
-        <w:t>Sensitive fields excluded:</w:t>
-      </w:r>
-      <w:r>
-        <w:t xml:space="preserve"> SSN (</w:t>
-      </w:r>
-      <w:proofErr w:type="spellStart"/>
-      <w:r>
-        <w:t>ee_ssn</w:t>
-      </w:r>
-      <w:proofErr w:type="spellEnd"/>
-      <w:r>
-        <w:t xml:space="preserve">, </w:t>
-      </w:r>
-      <w:proofErr w:type="spellStart"/>
-      <w:r>
-        <w:t>employee_ssn</w:t>
-      </w:r>
-      <w:proofErr w:type="spellEnd"/>
-      <w:r>
-        <w:t>).</w:t>
+        <w:t>D</w:t>
+      </w:r>
+      <w:r>
+        <w:rPr>
+          <w:b/>
+          <w:bCs/>
+        </w:rPr>
+        <w:t>IM_EMPLOYEES</w:t>
+      </w:r>
+    </w:p>
+    <w:p>
+      <w:pPr>
+        <w:pStyle w:val="BodyText"/>
+      </w:pPr>
+      <w:r>
+        <w:t xml:space="preserve">Provides detailed information about employees. </w:t>
+      </w:r>
+      <w:r>
+        <w:rPr>
+          <w:b/>
+          <w:bCs/>
+        </w:rPr>
+        <w:t>Sensitive fields excluded</w:t>
+      </w:r>
+      <w:r>
+        <w:rPr>
+          <w:b/>
+          <w:bCs/>
+        </w:rPr>
+        <w:t>:</w:t>
+      </w:r>
+      <w:r>
+        <w:t xml:space="preserve"> SSN</w:t>
+      </w:r>
+      <w:r>
+        <w:t>.</w:t>
       </w:r>
     </w:p>
     <w:p>
@@ -6643,7 +6650,10 @@
               <w:pStyle w:val="BodyText"/>
             </w:pPr>
             <w:r>
-              <w:t>Employee key</w:t>
+              <w:t>E</w:t>
+            </w:r>
+            <w:r>
+              <w:t>MPLOYEE_ID</w:t>
             </w:r>
           </w:p>
         </w:tc>
@@ -6687,7 +6697,7 @@
               <w:pStyle w:val="BodyText"/>
             </w:pPr>
             <w:r>
-              <w:t>Employee id</w:t>
+              <w:t>EMPLOYEE_SRC_ID</w:t>
             </w:r>
           </w:p>
         </w:tc>
@@ -6736,7 +6746,10 @@
               <w:pStyle w:val="BodyText"/>
             </w:pPr>
             <w:r>
-              <w:t>Employee name</w:t>
+              <w:t>E</w:t>
+            </w:r>
+            <w:r>
+              <w:t>MPLOYEE_NAME</w:t>
             </w:r>
           </w:p>
         </w:tc>
@@ -6785,7 +6798,10 @@
               <w:pStyle w:val="BodyText"/>
             </w:pPr>
             <w:r>
-              <w:t>Employee gender</w:t>
+              <w:t>E</w:t>
+            </w:r>
+            <w:r>
+              <w:t>MPLOYEE_GENDER</w:t>
             </w:r>
           </w:p>
         </w:tc>
@@ -6834,7 +6850,10 @@
               <w:pStyle w:val="BodyText"/>
             </w:pPr>
             <w:r>
-              <w:t>Employee email</w:t>
+              <w:t>E</w:t>
+            </w:r>
+            <w:r>
+              <w:t>MPLOYEE_EMAIL</w:t>
             </w:r>
           </w:p>
         </w:tc>
@@ -6883,7 +6902,10 @@
               <w:pStyle w:val="BodyText"/>
             </w:pPr>
             <w:r>
-              <w:t>Employee phone number</w:t>
+              <w:t>E</w:t>
+            </w:r>
+            <w:r>
+              <w:t>MPLOYEE_PHONE_NUMBER</w:t>
             </w:r>
           </w:p>
         </w:tc>
@@ -6932,7 +6954,10 @@
               <w:pStyle w:val="BodyText"/>
             </w:pPr>
             <w:r>
-              <w:t>Employee address</w:t>
+              <w:t>E</w:t>
+            </w:r>
+            <w:r>
+              <w:t>MPLOYEE_ADDRESS</w:t>
             </w:r>
           </w:p>
         </w:tc>
@@ -6981,7 +7006,10 @@
               <w:pStyle w:val="BodyText"/>
             </w:pPr>
             <w:r>
-              <w:t>Employee city</w:t>
+              <w:t>E</w:t>
+            </w:r>
+            <w:r>
+              <w:t>MPLOYEE_CITY</w:t>
             </w:r>
           </w:p>
         </w:tc>
@@ -7030,7 +7058,7 @@
               <w:pStyle w:val="BodyText"/>
             </w:pPr>
             <w:r>
-              <w:t>Employee state</w:t>
+              <w:t>EMPLOYEE_STATE</w:t>
             </w:r>
           </w:p>
         </w:tc>
@@ -7079,7 +7107,10 @@
               <w:pStyle w:val="BodyText"/>
             </w:pPr>
             <w:r>
-              <w:t>Employee postal code</w:t>
+              <w:t>E</w:t>
+            </w:r>
+            <w:r>
+              <w:t>MPLOYEE_POSTAL_CODE</w:t>
             </w:r>
           </w:p>
         </w:tc>
@@ -7134,22 +7165,22 @@
           <w:b/>
           <w:bCs/>
         </w:rPr>
-        <w:t xml:space="preserve">Dim </w:t>
-      </w:r>
-      <w:r>
-        <w:rPr>
-          <w:b/>
-          <w:bCs/>
-        </w:rPr>
-        <w:t>Product</w:t>
-      </w:r>
-    </w:p>
-    <w:p>
-      <w:pPr>
-        <w:pStyle w:val="BodyText"/>
-      </w:pPr>
-      <w:r>
-        <w:t>&lt;description&gt;</w:t>
+        <w:t>D</w:t>
+      </w:r>
+      <w:r>
+        <w:rPr>
+          <w:b/>
+          <w:bCs/>
+        </w:rPr>
+        <w:t>IM_PRODUCTS</w:t>
+      </w:r>
+    </w:p>
+    <w:p>
+      <w:pPr>
+        <w:pStyle w:val="BodyText"/>
+      </w:pPr>
+      <w:r>
+        <w:t>Provides detailed information about products.</w:t>
       </w:r>
     </w:p>
     <w:p>
@@ -7284,7 +7315,10 @@
               <w:pStyle w:val="BodyText"/>
             </w:pPr>
             <w:r>
-              <w:t>Product key</w:t>
+              <w:t>P</w:t>
+            </w:r>
+            <w:r>
+              <w:t>RODUCT_ID</w:t>
             </w:r>
           </w:p>
         </w:tc>
@@ -7328,7 +7362,10 @@
               <w:pStyle w:val="BodyText"/>
             </w:pPr>
             <w:r>
-              <w:t>Product code</w:t>
+              <w:t>P</w:t>
+            </w:r>
+            <w:r>
+              <w:t>RODUCT_SRC_ID</w:t>
             </w:r>
           </w:p>
         </w:tc>
@@ -7378,7 +7415,10 @@
             </w:pPr>
             <w:r>
               <w:lastRenderedPageBreak/>
-              <w:t>Product top category</w:t>
+              <w:t>P</w:t>
+            </w:r>
+            <w:r>
+              <w:t>RODUCT_TOP_CATEGORY</w:t>
             </w:r>
           </w:p>
         </w:tc>
@@ -7427,7 +7467,10 @@
               <w:pStyle w:val="BodyText"/>
             </w:pPr>
             <w:r>
-              <w:t>Product category</w:t>
+              <w:t>P</w:t>
+            </w:r>
+            <w:r>
+              <w:t>RODUCT_CATEGORY</w:t>
             </w:r>
           </w:p>
         </w:tc>
@@ -7476,7 +7519,10 @@
               <w:pStyle w:val="BodyText"/>
             </w:pPr>
             <w:r>
-              <w:t>Product subcategory</w:t>
+              <w:t>P</w:t>
+            </w:r>
+            <w:r>
+              <w:t>RODUCT_SUBCATEGORY</w:t>
             </w:r>
           </w:p>
         </w:tc>
@@ -7525,7 +7571,7 @@
               <w:pStyle w:val="BodyText"/>
             </w:pPr>
             <w:r>
-              <w:t>Description</w:t>
+              <w:t>PRODUCT_DESCRIPTION</w:t>
             </w:r>
           </w:p>
         </w:tc>
@@ -7573,11 +7619,9 @@
             <w:pPr>
               <w:pStyle w:val="BodyText"/>
             </w:pPr>
-            <w:proofErr w:type="spellStart"/>
-            <w:r>
-              <w:t>Colour</w:t>
-            </w:r>
-            <w:proofErr w:type="spellEnd"/>
+            <w:r>
+              <w:t>PRODUCT_COLOUR</w:t>
+            </w:r>
           </w:p>
         </w:tc>
         <w:tc>
@@ -7630,7 +7674,7 @@
               <w:pStyle w:val="BodyText"/>
             </w:pPr>
             <w:r>
-              <w:t>Size</w:t>
+              <w:t>PRODUCT_SIZE</w:t>
             </w:r>
           </w:p>
         </w:tc>
@@ -7661,10 +7705,7 @@
             </w:r>
             <w:proofErr w:type="gramEnd"/>
             <w:r>
-              <w:t>2</w:t>
-            </w:r>
-            <w:r>
-              <w:t>0)</w:t>
+              <w:t>20)</w:t>
             </w:r>
           </w:p>
         </w:tc>
@@ -7681,11 +7722,9 @@
             <w:pPr>
               <w:pStyle w:val="BodyText"/>
             </w:pPr>
-            <w:proofErr w:type="spellStart"/>
-            <w:r>
-              <w:t>Min_amount</w:t>
-            </w:r>
-            <w:proofErr w:type="spellEnd"/>
+            <w:r>
+              <w:t>PRODUCT_MIN_AMOUNT</w:t>
+            </w:r>
           </w:p>
         </w:tc>
         <w:tc>
@@ -7739,22 +7778,22 @@
           <w:b/>
           <w:bCs/>
         </w:rPr>
-        <w:t xml:space="preserve">Dim </w:t>
-      </w:r>
-      <w:r>
-        <w:rPr>
-          <w:b/>
-          <w:bCs/>
-        </w:rPr>
-        <w:t>Store</w:t>
-      </w:r>
-    </w:p>
-    <w:p>
-      <w:pPr>
-        <w:pStyle w:val="BodyText"/>
-      </w:pPr>
-      <w:r>
-        <w:t>&lt;description&gt;</w:t>
+        <w:t>D</w:t>
+      </w:r>
+      <w:r>
+        <w:rPr>
+          <w:b/>
+          <w:bCs/>
+        </w:rPr>
+        <w:t>IM_STORES</w:t>
+      </w:r>
+    </w:p>
+    <w:p>
+      <w:pPr>
+        <w:pStyle w:val="BodyText"/>
+      </w:pPr>
+      <w:r>
+        <w:t xml:space="preserve">Provides detailed information about stores. </w:t>
       </w:r>
       <w:r>
         <w:t>For e-commerce records, store address fields are set to N/A, and channel is set to ECOMMERCE</w:t>
@@ -7892,7 +7931,7 @@
               <w:pStyle w:val="BodyText"/>
             </w:pPr>
             <w:r>
-              <w:t>Store key</w:t>
+              <w:t>STORE_ID</w:t>
             </w:r>
           </w:p>
         </w:tc>
@@ -7936,7 +7975,7 @@
               <w:pStyle w:val="BodyText"/>
             </w:pPr>
             <w:r>
-              <w:t>Store code</w:t>
+              <w:t>STORE_SRC_ID</w:t>
             </w:r>
           </w:p>
         </w:tc>
@@ -7985,7 +8024,7 @@
               <w:pStyle w:val="BodyText"/>
             </w:pPr>
             <w:r>
-              <w:t>Channel</w:t>
+              <w:t>CHANNEL</w:t>
             </w:r>
           </w:p>
         </w:tc>
@@ -8016,10 +8055,7 @@
             </w:r>
             <w:proofErr w:type="gramEnd"/>
             <w:r>
-              <w:t>2</w:t>
-            </w:r>
-            <w:r>
-              <w:t>0)</w:t>
+              <w:t>20)</w:t>
             </w:r>
           </w:p>
         </w:tc>
@@ -8037,7 +8073,7 @@
               <w:pStyle w:val="BodyText"/>
             </w:pPr>
             <w:r>
-              <w:t>Zone code</w:t>
+              <w:t>ZONE_CODE</w:t>
             </w:r>
           </w:p>
         </w:tc>
@@ -8086,7 +8122,10 @@
               <w:pStyle w:val="BodyText"/>
             </w:pPr>
             <w:r>
-              <w:t>Store address</w:t>
+              <w:t>S</w:t>
+            </w:r>
+            <w:r>
+              <w:t>TORE_ADDRESS</w:t>
             </w:r>
           </w:p>
         </w:tc>
@@ -8135,7 +8174,10 @@
               <w:pStyle w:val="BodyText"/>
             </w:pPr>
             <w:r>
-              <w:t xml:space="preserve">Store city </w:t>
+              <w:t>S</w:t>
+            </w:r>
+            <w:r>
+              <w:t>TORE_CITY</w:t>
             </w:r>
           </w:p>
         </w:tc>
@@ -8184,7 +8226,10 @@
               <w:pStyle w:val="BodyText"/>
             </w:pPr>
             <w:r>
-              <w:t>Store state</w:t>
+              <w:t>S</w:t>
+            </w:r>
+            <w:r>
+              <w:t>TORE_STATE</w:t>
             </w:r>
           </w:p>
         </w:tc>
@@ -8233,7 +8278,10 @@
               <w:pStyle w:val="BodyText"/>
             </w:pPr>
             <w:r>
-              <w:t>Store postal code</w:t>
+              <w:t>S</w:t>
+            </w:r>
+            <w:r>
+              <w:t>TORE_POSTAL_CODE</w:t>
             </w:r>
           </w:p>
         </w:tc>
@@ -8288,22 +8336,22 @@
           <w:b/>
           <w:bCs/>
         </w:rPr>
-        <w:t xml:space="preserve">Dim </w:t>
-      </w:r>
-      <w:r>
-        <w:rPr>
-          <w:b/>
-          <w:bCs/>
-        </w:rPr>
-        <w:t>Payment Type</w:t>
-      </w:r>
-    </w:p>
-    <w:p>
-      <w:pPr>
-        <w:pStyle w:val="BodyText"/>
-      </w:pPr>
-      <w:r>
-        <w:t>&lt;description&gt;</w:t>
+        <w:t>D</w:t>
+      </w:r>
+      <w:r>
+        <w:rPr>
+          <w:b/>
+          <w:bCs/>
+        </w:rPr>
+        <w:t>IM_PAYMENT_TYPES</w:t>
+      </w:r>
+    </w:p>
+    <w:p>
+      <w:pPr>
+        <w:pStyle w:val="BodyText"/>
+      </w:pPr>
+      <w:r>
+        <w:t>Junk dimension for payment types.</w:t>
       </w:r>
     </w:p>
     <w:p>
@@ -8438,7 +8486,10 @@
               <w:pStyle w:val="BodyText"/>
             </w:pPr>
             <w:r>
-              <w:t>Payment type key</w:t>
+              <w:t>P</w:t>
+            </w:r>
+            <w:r>
+              <w:t>AYMENT_TYPE_ID</w:t>
             </w:r>
           </w:p>
         </w:tc>
@@ -8482,10 +8533,10 @@
               <w:pStyle w:val="BodyText"/>
             </w:pPr>
             <w:r>
-              <w:t xml:space="preserve">Payment type </w:t>
-            </w:r>
-            <w:r>
-              <w:t>name</w:t>
+              <w:t>P</w:t>
+            </w:r>
+            <w:r>
+              <w:t>AYMENT_TYPE_NAME</w:t>
             </w:r>
           </w:p>
         </w:tc>
@@ -8711,13 +8762,13 @@
           <w:p>
             <w:pPr>
               <w:pStyle w:val="BodyText"/>
-              <w:jc w:val="center"/>
-            </w:pPr>
-            <w:proofErr w:type="spellStart"/>
-            <w:r>
-              <w:t>Sales_key</w:t>
-            </w:r>
-            <w:proofErr w:type="spellEnd"/>
+            </w:pPr>
+            <w:r>
+              <w:t>S</w:t>
+            </w:r>
+            <w:r>
+              <w:t>ALES_ID</w:t>
+            </w:r>
           </w:p>
         </w:tc>
         <w:tc>
@@ -8776,13 +8827,13 @@
           <w:p>
             <w:pPr>
               <w:pStyle w:val="BodyText"/>
-              <w:jc w:val="center"/>
-            </w:pPr>
-            <w:proofErr w:type="spellStart"/>
-            <w:r>
-              <w:t>Date_key</w:t>
-            </w:r>
-            <w:proofErr w:type="spellEnd"/>
+            </w:pPr>
+            <w:r>
+              <w:t>D</w:t>
+            </w:r>
+            <w:r>
+              <w:t>ATE_ID</w:t>
+            </w:r>
           </w:p>
         </w:tc>
         <w:tc>
@@ -8841,10 +8892,12 @@
           <w:p>
             <w:pPr>
               <w:pStyle w:val="BodyText"/>
-              <w:jc w:val="center"/>
-            </w:pPr>
-            <w:r>
-              <w:t>Customer_key</w:t>
+            </w:pPr>
+            <w:r>
+              <w:t>C</w:t>
+            </w:r>
+            <w:r>
+              <w:t>USTOMER_ID</w:t>
             </w:r>
           </w:p>
         </w:tc>
@@ -8904,13 +8957,10 @@
           <w:p>
             <w:pPr>
               <w:pStyle w:val="BodyText"/>
-              <w:jc w:val="center"/>
-            </w:pPr>
-            <w:proofErr w:type="spellStart"/>
-            <w:r>
-              <w:t>Employee_key</w:t>
-            </w:r>
-            <w:proofErr w:type="spellEnd"/>
+            </w:pPr>
+            <w:r>
+              <w:t>EMPLOYEE_ID</w:t>
+            </w:r>
           </w:p>
         </w:tc>
         <w:tc>
@@ -8969,13 +9019,13 @@
           <w:p>
             <w:pPr>
               <w:pStyle w:val="BodyText"/>
-              <w:jc w:val="center"/>
-            </w:pPr>
-            <w:proofErr w:type="spellStart"/>
-            <w:r>
-              <w:t>Product_key</w:t>
-            </w:r>
-            <w:proofErr w:type="spellEnd"/>
+            </w:pPr>
+            <w:r>
+              <w:t>P</w:t>
+            </w:r>
+            <w:r>
+              <w:t>RODUCT_ID</w:t>
+            </w:r>
           </w:p>
         </w:tc>
         <w:tc>
@@ -9034,13 +9084,13 @@
           <w:p>
             <w:pPr>
               <w:pStyle w:val="BodyText"/>
-              <w:jc w:val="center"/>
-            </w:pPr>
-            <w:proofErr w:type="spellStart"/>
-            <w:r>
-              <w:t>Store_key</w:t>
-            </w:r>
-            <w:proofErr w:type="spellEnd"/>
+            </w:pPr>
+            <w:r>
+              <w:t>S</w:t>
+            </w:r>
+            <w:r>
+              <w:t>TORE_ID</w:t>
+            </w:r>
           </w:p>
         </w:tc>
         <w:tc>
@@ -9099,13 +9149,13 @@
           <w:p>
             <w:pPr>
               <w:pStyle w:val="BodyText"/>
-              <w:jc w:val="center"/>
-            </w:pPr>
-            <w:proofErr w:type="spellStart"/>
-            <w:r>
-              <w:t>Payment_key</w:t>
-            </w:r>
-            <w:proofErr w:type="spellEnd"/>
+            </w:pPr>
+            <w:r>
+              <w:t>P</w:t>
+            </w:r>
+            <w:r>
+              <w:t>AYMENT_TYPE_ID</w:t>
+            </w:r>
           </w:p>
         </w:tc>
         <w:tc>
@@ -9123,7 +9173,10 @@
               <w:pStyle w:val="BodyText"/>
             </w:pPr>
             <w:r>
-              <w:t>Payment details (card information, payment method)</w:t>
+              <w:t xml:space="preserve">Payment </w:t>
+            </w:r>
+            <w:r>
+              <w:t>type</w:t>
             </w:r>
           </w:p>
         </w:tc>
@@ -9164,13 +9217,10 @@
           <w:p>
             <w:pPr>
               <w:pStyle w:val="BodyText"/>
-              <w:jc w:val="center"/>
-            </w:pPr>
-            <w:proofErr w:type="spellStart"/>
-            <w:r>
-              <w:t>Payment_id</w:t>
-            </w:r>
-            <w:proofErr w:type="spellEnd"/>
+            </w:pPr>
+            <w:r>
+              <w:t>PAYMENT_SRC_ID</w:t>
+            </w:r>
           </w:p>
         </w:tc>
         <w:tc>
@@ -9234,13 +9284,13 @@
           <w:p>
             <w:pPr>
               <w:pStyle w:val="BodyText"/>
-              <w:jc w:val="center"/>
-            </w:pPr>
-            <w:proofErr w:type="spellStart"/>
-            <w:r>
-              <w:t>Sales_amount</w:t>
-            </w:r>
-            <w:proofErr w:type="spellEnd"/>
+            </w:pPr>
+            <w:r>
+              <w:t>S</w:t>
+            </w:r>
+            <w:r>
+              <w:t>ALES_AMOUNT</w:t>
+            </w:r>
           </w:p>
         </w:tc>
         <w:tc>
@@ -9304,10 +9354,12 @@
           <w:p>
             <w:pPr>
               <w:pStyle w:val="BodyText"/>
-              <w:jc w:val="center"/>
-            </w:pPr>
-            <w:r>
-              <w:t>Discount</w:t>
+            </w:pPr>
+            <w:r>
+              <w:t>D</w:t>
+            </w:r>
+            <w:r>
+              <w:t>ISCOUNT</w:t>
             </w:r>
           </w:p>
         </w:tc>
@@ -9372,13 +9424,10 @@
           <w:p>
             <w:pPr>
               <w:pStyle w:val="BodyText"/>
-              <w:jc w:val="center"/>
-            </w:pPr>
-            <w:proofErr w:type="spellStart"/>
-            <w:r>
-              <w:t>Net_amount</w:t>
-            </w:r>
-            <w:proofErr w:type="spellEnd"/>
+            </w:pPr>
+            <w:r>
+              <w:t>NET AMOUNT</w:t>
+            </w:r>
           </w:p>
         </w:tc>
         <w:tc>
@@ -9447,10 +9496,12 @@
           <w:p>
             <w:pPr>
               <w:pStyle w:val="BodyText"/>
-              <w:jc w:val="center"/>
-            </w:pPr>
-            <w:r>
-              <w:t>Cost</w:t>
+            </w:pPr>
+            <w:r>
+              <w:t>C</w:t>
+            </w:r>
+            <w:r>
+              <w:t>OST</w:t>
             </w:r>
           </w:p>
         </w:tc>
@@ -9515,10 +9566,9 @@
           <w:p>
             <w:pPr>
               <w:pStyle w:val="BodyText"/>
-              <w:jc w:val="center"/>
-            </w:pPr>
-            <w:r>
-              <w:t>quantity</w:t>
+            </w:pPr>
+            <w:r>
+              <w:t>QUANTITY</w:t>
             </w:r>
           </w:p>
         </w:tc>
@@ -16851,12 +16901,17 @@
 </file>
 
 <file path=customXml/item2.xml><?xml version="1.0" encoding="utf-8"?>
-<?mso-contentType ?>
-<FormTemplates xmlns="http://schemas.microsoft.com/sharepoint/v3/contenttype/forms">
-  <Display>DocumentLibraryForm</Display>
-  <Edit>DocumentLibraryForm</Edit>
-  <New>DocumentLibraryForm</New>
-</FormTemplates>
+<p:properties xmlns:p="http://schemas.microsoft.com/office/2006/metadata/properties" xmlns:xsi="http://www.w3.org/2001/XMLSchema-instance" xmlns:pc="http://schemas.microsoft.com/office/infopath/2007/PartnerControls">
+  <documentManagement>
+    <SharedWithUsers xmlns="7f0dcb33-685e-48d8-b644-2ef2786c1229">
+      <UserInfo>
+        <DisplayName/>
+        <AccountId xsi:nil="true"/>
+        <AccountType/>
+      </UserInfo>
+    </SharedWithUsers>
+  </documentManagement>
+</p:properties>
 </file>
 
 <file path=customXml/item3.xml><?xml version="1.0" encoding="utf-8"?>
@@ -17045,17 +17100,12 @@
 </file>
 
 <file path=customXml/item4.xml><?xml version="1.0" encoding="utf-8"?>
-<p:properties xmlns:p="http://schemas.microsoft.com/office/2006/metadata/properties" xmlns:xsi="http://www.w3.org/2001/XMLSchema-instance" xmlns:pc="http://schemas.microsoft.com/office/infopath/2007/PartnerControls">
-  <documentManagement>
-    <SharedWithUsers xmlns="7f0dcb33-685e-48d8-b644-2ef2786c1229">
-      <UserInfo>
-        <DisplayName/>
-        <AccountId xsi:nil="true"/>
-        <AccountType/>
-      </UserInfo>
-    </SharedWithUsers>
-  </documentManagement>
-</p:properties>
+<?mso-contentType ?>
+<FormTemplates xmlns="http://schemas.microsoft.com/sharepoint/v3/contenttype/forms">
+  <Display>DocumentLibraryForm</Display>
+  <Edit>DocumentLibraryForm</Edit>
+  <New>DocumentLibraryForm</New>
+</FormTemplates>
 </file>
 
 <file path=customXml/itemProps1.xml><?xml version="1.0" encoding="utf-8"?>
@@ -17067,9 +17117,11 @@
 </file>
 
 <file path=customXml/itemProps2.xml><?xml version="1.0" encoding="utf-8"?>
-<ds:datastoreItem xmlns:ds="http://schemas.openxmlformats.org/officeDocument/2006/customXml" ds:itemID="{CEAD825D-2413-46BA-BB1F-DCE637B19B0C}">
+<ds:datastoreItem xmlns:ds="http://schemas.openxmlformats.org/officeDocument/2006/customXml" ds:itemID="{E4B4D352-B35B-4B3A-95D2-902933709BD2}">
   <ds:schemaRefs>
-    <ds:schemaRef ds:uri="http://schemas.microsoft.com/sharepoint/v3/contenttype/forms"/>
+    <ds:schemaRef ds:uri="http://schemas.microsoft.com/office/2006/metadata/properties"/>
+    <ds:schemaRef ds:uri="http://schemas.microsoft.com/office/infopath/2007/PartnerControls"/>
+    <ds:schemaRef ds:uri="7f0dcb33-685e-48d8-b644-2ef2786c1229"/>
   </ds:schemaRefs>
 </ds:datastoreItem>
 </file>
@@ -17094,11 +17146,9 @@
 </file>
 
 <file path=customXml/itemProps4.xml><?xml version="1.0" encoding="utf-8"?>
-<ds:datastoreItem xmlns:ds="http://schemas.openxmlformats.org/officeDocument/2006/customXml" ds:itemID="{E4B4D352-B35B-4B3A-95D2-902933709BD2}">
+<ds:datastoreItem xmlns:ds="http://schemas.openxmlformats.org/officeDocument/2006/customXml" ds:itemID="{CEAD825D-2413-46BA-BB1F-DCE637B19B0C}">
   <ds:schemaRefs>
-    <ds:schemaRef ds:uri="http://schemas.microsoft.com/office/2006/metadata/properties"/>
-    <ds:schemaRef ds:uri="http://schemas.microsoft.com/office/infopath/2007/PartnerControls"/>
-    <ds:schemaRef ds:uri="7f0dcb33-685e-48d8-b644-2ef2786c1229"/>
+    <ds:schemaRef ds:uri="http://schemas.microsoft.com/sharepoint/v3/contenttype/forms"/>
   </ds:schemaRefs>
 </ds:datastoreItem>
 </file>
</xml_diff>

<commit_message>
(fix): fixed cost, min_amount, line_product_amount meanings, set BIGINT for all PKs, added card dimension
</commit_message>
<xml_diff>
--- a/dwh_design/Business_Template.docx
+++ b/dwh_design/Business_Template.docx
@@ -5244,7 +5244,7 @@
               <w:pStyle w:val="BodyText"/>
             </w:pPr>
             <w:r>
-              <w:t>INTEGER</w:t>
+              <w:t>BIGINT</w:t>
             </w:r>
           </w:p>
         </w:tc>
@@ -5915,10 +5915,7 @@
             </w:pPr>
             <w:r>
               <w:lastRenderedPageBreak/>
-              <w:t>C</w:t>
-            </w:r>
-            <w:r>
-              <w:t>USTOMER_ID</w:t>
+              <w:t>CUSTOMER_ID</w:t>
             </w:r>
           </w:p>
         </w:tc>
@@ -5944,7 +5941,7 @@
               <w:pStyle w:val="BodyText"/>
             </w:pPr>
             <w:r>
-              <w:t>INTEGER</w:t>
+              <w:t>BIGINT</w:t>
             </w:r>
           </w:p>
         </w:tc>
@@ -6011,10 +6008,7 @@
               <w:pStyle w:val="BodyText"/>
             </w:pPr>
             <w:r>
-              <w:t>C</w:t>
-            </w:r>
-            <w:r>
-              <w:t>USTOMER_NAME</w:t>
+              <w:t>CUSTOMER_NAME</w:t>
             </w:r>
           </w:p>
         </w:tc>
@@ -6063,10 +6057,7 @@
               <w:pStyle w:val="BodyText"/>
             </w:pPr>
             <w:r>
-              <w:t>C</w:t>
-            </w:r>
-            <w:r>
-              <w:t>USTOMER_GENDER</w:t>
+              <w:t>CUSTOMER_GENDER</w:t>
             </w:r>
           </w:p>
         </w:tc>
@@ -6115,10 +6106,7 @@
               <w:pStyle w:val="BodyText"/>
             </w:pPr>
             <w:r>
-              <w:t>C</w:t>
-            </w:r>
-            <w:r>
-              <w:t>USTOMER_AGE</w:t>
+              <w:t>CUSTOMER_AGE</w:t>
             </w:r>
           </w:p>
         </w:tc>
@@ -6162,10 +6150,7 @@
               <w:pStyle w:val="BodyText"/>
             </w:pPr>
             <w:r>
-              <w:t>C</w:t>
-            </w:r>
-            <w:r>
-              <w:t>USTOMER_EMAIL</w:t>
+              <w:t>CUSTOMER_EMAIL</w:t>
             </w:r>
           </w:p>
         </w:tc>
@@ -6214,10 +6199,7 @@
               <w:pStyle w:val="BodyText"/>
             </w:pPr>
             <w:r>
-              <w:t>C</w:t>
-            </w:r>
-            <w:r>
-              <w:t>USTOMER_PHONE_NUMBER</w:t>
+              <w:t>CUSTOMER_PHONE_NUMBER</w:t>
             </w:r>
           </w:p>
         </w:tc>
@@ -6266,10 +6248,7 @@
               <w:pStyle w:val="BodyText"/>
             </w:pPr>
             <w:r>
-              <w:t>C</w:t>
-            </w:r>
-            <w:r>
-              <w:t>USTOMER_ADDRESS</w:t>
+              <w:t>CUSTOMER_ADDRESS</w:t>
             </w:r>
           </w:p>
         </w:tc>
@@ -6367,10 +6346,7 @@
               <w:pStyle w:val="BodyText"/>
             </w:pPr>
             <w:r>
-              <w:t>C</w:t>
-            </w:r>
-            <w:r>
-              <w:t>USTOMER_STATE</w:t>
+              <w:t>CUSTOMER_STATE</w:t>
             </w:r>
           </w:p>
         </w:tc>
@@ -6419,10 +6395,7 @@
               <w:pStyle w:val="BodyText"/>
             </w:pPr>
             <w:r>
-              <w:t>C</w:t>
-            </w:r>
-            <w:r>
-              <w:t>USTOMER_POSTAL_CODE</w:t>
+              <w:t>CUSTOMER_POSTAL_CODE</w:t>
             </w:r>
           </w:p>
         </w:tc>
@@ -6650,10 +6623,7 @@
               <w:pStyle w:val="BodyText"/>
             </w:pPr>
             <w:r>
-              <w:t>E</w:t>
-            </w:r>
-            <w:r>
-              <w:t>MPLOYEE_ID</w:t>
+              <w:t>EMPLOYEE_ID</w:t>
             </w:r>
           </w:p>
         </w:tc>
@@ -6679,7 +6649,7 @@
               <w:pStyle w:val="BodyText"/>
             </w:pPr>
             <w:r>
-              <w:t>INTEGER</w:t>
+              <w:t>BIGINT</w:t>
             </w:r>
           </w:p>
         </w:tc>
@@ -6746,10 +6716,7 @@
               <w:pStyle w:val="BodyText"/>
             </w:pPr>
             <w:r>
-              <w:t>E</w:t>
-            </w:r>
-            <w:r>
-              <w:t>MPLOYEE_NAME</w:t>
+              <w:t>EMPLOYEE_NAME</w:t>
             </w:r>
           </w:p>
         </w:tc>
@@ -6798,10 +6765,7 @@
               <w:pStyle w:val="BodyText"/>
             </w:pPr>
             <w:r>
-              <w:t>E</w:t>
-            </w:r>
-            <w:r>
-              <w:t>MPLOYEE_GENDER</w:t>
+              <w:t>EMPLOYEE_GENDER</w:t>
             </w:r>
           </w:p>
         </w:tc>
@@ -6850,10 +6814,7 @@
               <w:pStyle w:val="BodyText"/>
             </w:pPr>
             <w:r>
-              <w:t>E</w:t>
-            </w:r>
-            <w:r>
-              <w:t>MPLOYEE_EMAIL</w:t>
+              <w:t>EMPLOYEE_EMAIL</w:t>
             </w:r>
           </w:p>
         </w:tc>
@@ -6902,10 +6863,7 @@
               <w:pStyle w:val="BodyText"/>
             </w:pPr>
             <w:r>
-              <w:t>E</w:t>
-            </w:r>
-            <w:r>
-              <w:t>MPLOYEE_PHONE_NUMBER</w:t>
+              <w:t>EMPLOYEE_PHONE_NUMBER</w:t>
             </w:r>
           </w:p>
         </w:tc>
@@ -6954,10 +6912,7 @@
               <w:pStyle w:val="BodyText"/>
             </w:pPr>
             <w:r>
-              <w:t>E</w:t>
-            </w:r>
-            <w:r>
-              <w:t>MPLOYEE_ADDRESS</w:t>
+              <w:t>EMPLOYEE_ADDRESS</w:t>
             </w:r>
           </w:p>
         </w:tc>
@@ -7006,10 +6961,7 @@
               <w:pStyle w:val="BodyText"/>
             </w:pPr>
             <w:r>
-              <w:t>E</w:t>
-            </w:r>
-            <w:r>
-              <w:t>MPLOYEE_CITY</w:t>
+              <w:t>EMPLOYEE_CITY</w:t>
             </w:r>
           </w:p>
         </w:tc>
@@ -7107,10 +7059,7 @@
               <w:pStyle w:val="BodyText"/>
             </w:pPr>
             <w:r>
-              <w:t>E</w:t>
-            </w:r>
-            <w:r>
-              <w:t>MPLOYEE_POSTAL_CODE</w:t>
+              <w:t>EMPLOYEE_POSTAL_CODE</w:t>
             </w:r>
           </w:p>
         </w:tc>
@@ -7315,10 +7264,7 @@
               <w:pStyle w:val="BodyText"/>
             </w:pPr>
             <w:r>
-              <w:t>P</w:t>
-            </w:r>
-            <w:r>
-              <w:t>RODUCT_ID</w:t>
+              <w:t>PRODUCT_ID</w:t>
             </w:r>
           </w:p>
         </w:tc>
@@ -7344,7 +7290,7 @@
               <w:pStyle w:val="BodyText"/>
             </w:pPr>
             <w:r>
-              <w:t>INTEGER</w:t>
+              <w:t>BIGINT</w:t>
             </w:r>
           </w:p>
         </w:tc>
@@ -7362,10 +7308,7 @@
               <w:pStyle w:val="BodyText"/>
             </w:pPr>
             <w:r>
-              <w:t>P</w:t>
-            </w:r>
-            <w:r>
-              <w:t>RODUCT_SRC_ID</w:t>
+              <w:t>PRODUCT_SRC_ID</w:t>
             </w:r>
           </w:p>
         </w:tc>
@@ -7415,10 +7358,7 @@
             </w:pPr>
             <w:r>
               <w:lastRenderedPageBreak/>
-              <w:t>P</w:t>
-            </w:r>
-            <w:r>
-              <w:t>RODUCT_TOP_CATEGORY</w:t>
+              <w:t>PRODUCT_TOP_CATEGORY</w:t>
             </w:r>
           </w:p>
         </w:tc>
@@ -7467,10 +7407,7 @@
               <w:pStyle w:val="BodyText"/>
             </w:pPr>
             <w:r>
-              <w:t>P</w:t>
-            </w:r>
-            <w:r>
-              <w:t>RODUCT_CATEGORY</w:t>
+              <w:t>PRODUCT_CATEGORY</w:t>
             </w:r>
           </w:p>
         </w:tc>
@@ -7519,10 +7456,7 @@
               <w:pStyle w:val="BodyText"/>
             </w:pPr>
             <w:r>
-              <w:t>P</w:t>
-            </w:r>
-            <w:r>
-              <w:t>RODUCT_SUBCATEGORY</w:t>
+              <w:t>PRODUCT_SUBCATEGORY</w:t>
             </w:r>
           </w:p>
         </w:tc>
@@ -7957,7 +7891,7 @@
               <w:pStyle w:val="BodyText"/>
             </w:pPr>
             <w:r>
-              <w:t>INTEGER</w:t>
+              <w:t>BIGINT</w:t>
             </w:r>
           </w:p>
         </w:tc>
@@ -8122,10 +8056,7 @@
               <w:pStyle w:val="BodyText"/>
             </w:pPr>
             <w:r>
-              <w:t>S</w:t>
-            </w:r>
-            <w:r>
-              <w:t>TORE_ADDRESS</w:t>
+              <w:t>STORE_ADDRESS</w:t>
             </w:r>
           </w:p>
         </w:tc>
@@ -8174,10 +8105,7 @@
               <w:pStyle w:val="BodyText"/>
             </w:pPr>
             <w:r>
-              <w:t>S</w:t>
-            </w:r>
-            <w:r>
-              <w:t>TORE_CITY</w:t>
+              <w:t>STORE_CITY</w:t>
             </w:r>
           </w:p>
         </w:tc>
@@ -8226,10 +8154,7 @@
               <w:pStyle w:val="BodyText"/>
             </w:pPr>
             <w:r>
-              <w:t>S</w:t>
-            </w:r>
-            <w:r>
-              <w:t>TORE_STATE</w:t>
+              <w:t>STORE_STATE</w:t>
             </w:r>
           </w:p>
         </w:tc>
@@ -8278,10 +8203,7 @@
               <w:pStyle w:val="BodyText"/>
             </w:pPr>
             <w:r>
-              <w:t>S</w:t>
-            </w:r>
-            <w:r>
-              <w:t>TORE_POSTAL_CODE</w:t>
+              <w:t>STORE_POSTAL_CODE</w:t>
             </w:r>
           </w:p>
         </w:tc>
@@ -8486,10 +8408,7 @@
               <w:pStyle w:val="BodyText"/>
             </w:pPr>
             <w:r>
-              <w:t>P</w:t>
-            </w:r>
-            <w:r>
-              <w:t>AYMENT_TYPE_ID</w:t>
+              <w:t>PAYMENT_TYPE_ID</w:t>
             </w:r>
           </w:p>
         </w:tc>
@@ -8515,7 +8434,7 @@
               <w:pStyle w:val="BodyText"/>
             </w:pPr>
             <w:r>
-              <w:t>INTEGER</w:t>
+              <w:t>BIGINT</w:t>
             </w:r>
           </w:p>
         </w:tc>
@@ -8533,10 +8452,7 @@
               <w:pStyle w:val="BodyText"/>
             </w:pPr>
             <w:r>
-              <w:t>P</w:t>
-            </w:r>
-            <w:r>
-              <w:t>AYMENT_TYPE_NAME</w:t>
+              <w:t>PAYMENT_TYPE_NAME</w:t>
             </w:r>
           </w:p>
         </w:tc>
@@ -8764,10 +8680,7 @@
               <w:pStyle w:val="BodyText"/>
             </w:pPr>
             <w:r>
-              <w:t>S</w:t>
-            </w:r>
-            <w:r>
-              <w:t>ALES_ID</w:t>
+              <w:t>SALES_ID</w:t>
             </w:r>
           </w:p>
         </w:tc>
@@ -8805,7 +8718,7 @@
               <w:pStyle w:val="BodyText"/>
             </w:pPr>
             <w:r>
-              <w:t>INTEGER</w:t>
+              <w:t>BIGINT</w:t>
             </w:r>
           </w:p>
         </w:tc>
@@ -8829,10 +8742,10 @@
               <w:pStyle w:val="BodyText"/>
             </w:pPr>
             <w:r>
-              <w:t>D</w:t>
-            </w:r>
-            <w:r>
-              <w:t>ATE_ID</w:t>
+              <w:t>H</w:t>
+            </w:r>
+            <w:r>
+              <w:t>DATE_ID</w:t>
             </w:r>
           </w:p>
         </w:tc>
@@ -8870,7 +8783,7 @@
               <w:pStyle w:val="BodyText"/>
             </w:pPr>
             <w:r>
-              <w:t>INTEGER</w:t>
+              <w:t>BIGINT</w:t>
             </w:r>
           </w:p>
         </w:tc>
@@ -8894,10 +8807,7 @@
               <w:pStyle w:val="BodyText"/>
             </w:pPr>
             <w:r>
-              <w:t>C</w:t>
-            </w:r>
-            <w:r>
-              <w:t>USTOMER_ID</w:t>
+              <w:t>CUSTOMER_ID</w:t>
             </w:r>
           </w:p>
         </w:tc>
@@ -8935,7 +8845,7 @@
               <w:pStyle w:val="BodyText"/>
             </w:pPr>
             <w:r>
-              <w:t>INTEGER</w:t>
+              <w:t>BIGINT</w:t>
             </w:r>
           </w:p>
         </w:tc>
@@ -8997,7 +8907,7 @@
               <w:pStyle w:val="BodyText"/>
             </w:pPr>
             <w:r>
-              <w:t>INTEGER</w:t>
+              <w:t>BIGINT</w:t>
             </w:r>
           </w:p>
         </w:tc>
@@ -9021,10 +8931,7 @@
               <w:pStyle w:val="BodyText"/>
             </w:pPr>
             <w:r>
-              <w:t>P</w:t>
-            </w:r>
-            <w:r>
-              <w:t>RODUCT_ID</w:t>
+              <w:t>PRODUCT_ID</w:t>
             </w:r>
           </w:p>
         </w:tc>
@@ -9062,7 +8969,7 @@
               <w:pStyle w:val="BodyText"/>
             </w:pPr>
             <w:r>
-              <w:t>INTEGER</w:t>
+              <w:t>BIGINT</w:t>
             </w:r>
           </w:p>
         </w:tc>
@@ -9086,10 +8993,7 @@
               <w:pStyle w:val="BodyText"/>
             </w:pPr>
             <w:r>
-              <w:t>S</w:t>
-            </w:r>
-            <w:r>
-              <w:t>TORE_ID</w:t>
+              <w:t>STORE_ID</w:t>
             </w:r>
           </w:p>
         </w:tc>
@@ -9127,7 +9031,7 @@
               <w:pStyle w:val="BodyText"/>
             </w:pPr>
             <w:r>
-              <w:t>INTEGER</w:t>
+              <w:t>BIGINT</w:t>
             </w:r>
           </w:p>
         </w:tc>
@@ -9151,10 +9055,7 @@
               <w:pStyle w:val="BodyText"/>
             </w:pPr>
             <w:r>
-              <w:t>P</w:t>
-            </w:r>
-            <w:r>
-              <w:t>AYMENT_TYPE_ID</w:t>
+              <w:t>PAYMENT_TYPE_ID</w:t>
             </w:r>
           </w:p>
         </w:tc>
@@ -9173,10 +9074,7 @@
               <w:pStyle w:val="BodyText"/>
             </w:pPr>
             <w:r>
-              <w:t xml:space="preserve">Payment </w:t>
-            </w:r>
-            <w:r>
-              <w:t>type</w:t>
+              <w:t>Payment type</w:t>
             </w:r>
           </w:p>
         </w:tc>
@@ -9195,7 +9093,7 @@
               <w:pStyle w:val="BodyText"/>
             </w:pPr>
             <w:r>
-              <w:t>INTEGER</w:t>
+              <w:t>BIGINT</w:t>
             </w:r>
           </w:p>
         </w:tc>
@@ -9286,10 +9184,7 @@
               <w:pStyle w:val="BodyText"/>
             </w:pPr>
             <w:r>
-              <w:t>S</w:t>
-            </w:r>
-            <w:r>
-              <w:t>ALES_AMOUNT</w:t>
+              <w:t>SALES_AMOUNT</w:t>
             </w:r>
           </w:p>
         </w:tc>
@@ -9356,10 +9251,7 @@
               <w:pStyle w:val="BodyText"/>
             </w:pPr>
             <w:r>
-              <w:t>D</w:t>
-            </w:r>
-            <w:r>
-              <w:t>ISCOUNT</w:t>
+              <w:t>DISCOUNT</w:t>
             </w:r>
           </w:p>
         </w:tc>
@@ -9498,10 +9390,7 @@
               <w:pStyle w:val="BodyText"/>
             </w:pPr>
             <w:r>
-              <w:t>C</w:t>
-            </w:r>
-            <w:r>
-              <w:t>OST</w:t>
+              <w:t>COST</w:t>
             </w:r>
           </w:p>
         </w:tc>
@@ -16011,6 +15900,7 @@
   <w:style w:type="character" w:default="1" w:styleId="DefaultParagraphFont">
     <w:name w:val="Default Paragraph Font"/>
     <w:uiPriority w:val="1"/>
+    <w:semiHidden/>
     <w:unhideWhenUsed/>
   </w:style>
   <w:style w:type="table" w:default="1" w:styleId="TableNormal">
@@ -16897,10 +16787,6 @@
 </file>
 
 <file path=customXml/item1.xml><?xml version="1.0" encoding="utf-8"?>
-<b:Sources xmlns:b="http://schemas.openxmlformats.org/officeDocument/2006/bibliography" xmlns="http://schemas.openxmlformats.org/officeDocument/2006/bibliography" SelectedStyle="\APASixthEditionOfficeOnline.xsl" StyleName="APA" Version="6"/>
-</file>
-
-<file path=customXml/item2.xml><?xml version="1.0" encoding="utf-8"?>
 <p:properties xmlns:p="http://schemas.microsoft.com/office/2006/metadata/properties" xmlns:xsi="http://www.w3.org/2001/XMLSchema-instance" xmlns:pc="http://schemas.microsoft.com/office/infopath/2007/PartnerControls">
   <documentManagement>
     <SharedWithUsers xmlns="7f0dcb33-685e-48d8-b644-2ef2786c1229">
@@ -16914,7 +16800,20 @@
 </p:properties>
 </file>
 
+<file path=customXml/item2.xml><?xml version="1.0" encoding="utf-8"?>
+<b:Sources xmlns:b="http://schemas.openxmlformats.org/officeDocument/2006/bibliography" xmlns="http://schemas.openxmlformats.org/officeDocument/2006/bibliography" SelectedStyle="\APASixthEditionOfficeOnline.xsl" StyleName="APA" Version="6"/>
+</file>
+
 <file path=customXml/item3.xml><?xml version="1.0" encoding="utf-8"?>
+<?mso-contentType ?>
+<FormTemplates xmlns="http://schemas.microsoft.com/sharepoint/v3/contenttype/forms">
+  <Display>DocumentLibraryForm</Display>
+  <Edit>DocumentLibraryForm</Edit>
+  <New>DocumentLibraryForm</New>
+</FormTemplates>
+</file>
+
+<file path=customXml/item4.xml><?xml version="1.0" encoding="utf-8"?>
 <ct:contentTypeSchema xmlns:ct="http://schemas.microsoft.com/office/2006/metadata/contentType" xmlns:ma="http://schemas.microsoft.com/office/2006/metadata/properties/metaAttributes" ct:_="" ma:_="" ma:contentTypeName="Document" ma:contentTypeID="0x010100B3483E581E535547A5C5133F57803043" ma:contentTypeVersion="7" ma:contentTypeDescription="Create a new document." ma:contentTypeScope="" ma:versionID="26f0e3c34181377a2b428b97b0aacf58">
   <xsd:schema xmlns:xsd="http://www.w3.org/2001/XMLSchema" xmlns:xs="http://www.w3.org/2001/XMLSchema" xmlns:p="http://schemas.microsoft.com/office/2006/metadata/properties" xmlns:ns2="0a074a96-e172-4849-a42b-0522bc04182b" xmlns:ns3="7f0dcb33-685e-48d8-b644-2ef2786c1229" targetNamespace="http://schemas.microsoft.com/office/2006/metadata/properties" ma:root="true" ma:fieldsID="c6eeec6c9df2cadb2fce64bd00511549" ns2:_="" ns3:_="">
     <xsd:import namespace="0a074a96-e172-4849-a42b-0522bc04182b"/>
@@ -17099,24 +16998,7 @@
 </ct:contentTypeSchema>
 </file>
 
-<file path=customXml/item4.xml><?xml version="1.0" encoding="utf-8"?>
-<?mso-contentType ?>
-<FormTemplates xmlns="http://schemas.microsoft.com/sharepoint/v3/contenttype/forms">
-  <Display>DocumentLibraryForm</Display>
-  <Edit>DocumentLibraryForm</Edit>
-  <New>DocumentLibraryForm</New>
-</FormTemplates>
-</file>
-
 <file path=customXml/itemProps1.xml><?xml version="1.0" encoding="utf-8"?>
-<ds:datastoreItem xmlns:ds="http://schemas.openxmlformats.org/officeDocument/2006/customXml" ds:itemID="{E17B8ADD-EB79-48B6-BB52-99D12F97A336}">
-  <ds:schemaRefs>
-    <ds:schemaRef ds:uri="http://schemas.openxmlformats.org/officeDocument/2006/bibliography"/>
-  </ds:schemaRefs>
-</ds:datastoreItem>
-</file>
-
-<file path=customXml/itemProps2.xml><?xml version="1.0" encoding="utf-8"?>
 <ds:datastoreItem xmlns:ds="http://schemas.openxmlformats.org/officeDocument/2006/customXml" ds:itemID="{E4B4D352-B35B-4B3A-95D2-902933709BD2}">
   <ds:schemaRefs>
     <ds:schemaRef ds:uri="http://schemas.microsoft.com/office/2006/metadata/properties"/>
@@ -17126,7 +17008,23 @@
 </ds:datastoreItem>
 </file>
 
+<file path=customXml/itemProps2.xml><?xml version="1.0" encoding="utf-8"?>
+<ds:datastoreItem xmlns:ds="http://schemas.openxmlformats.org/officeDocument/2006/customXml" ds:itemID="{E17B8ADD-EB79-48B6-BB52-99D12F97A336}">
+  <ds:schemaRefs>
+    <ds:schemaRef ds:uri="http://schemas.openxmlformats.org/officeDocument/2006/bibliography"/>
+  </ds:schemaRefs>
+</ds:datastoreItem>
+</file>
+
 <file path=customXml/itemProps3.xml><?xml version="1.0" encoding="utf-8"?>
+<ds:datastoreItem xmlns:ds="http://schemas.openxmlformats.org/officeDocument/2006/customXml" ds:itemID="{CEAD825D-2413-46BA-BB1F-DCE637B19B0C}">
+  <ds:schemaRefs>
+    <ds:schemaRef ds:uri="http://schemas.microsoft.com/sharepoint/v3/contenttype/forms"/>
+  </ds:schemaRefs>
+</ds:datastoreItem>
+</file>
+
+<file path=customXml/itemProps4.xml><?xml version="1.0" encoding="utf-8"?>
 <ds:datastoreItem xmlns:ds="http://schemas.openxmlformats.org/officeDocument/2006/customXml" ds:itemID="{2240CE2F-0274-489A-BA80-8887BFB6B269}">
   <ds:schemaRefs>
     <ds:schemaRef ds:uri="http://schemas.microsoft.com/office/2006/metadata/contentType"/>
@@ -17143,12 +17041,4 @@
     <ds:schemaRef ds:uri="http://schemas.microsoft.com/internal/obd"/>
   </ds:schemaRefs>
 </ds:datastoreItem>
-</file>
-
-<file path=customXml/itemProps4.xml><?xml version="1.0" encoding="utf-8"?>
-<ds:datastoreItem xmlns:ds="http://schemas.openxmlformats.org/officeDocument/2006/customXml" ds:itemID="{CEAD825D-2413-46BA-BB1F-DCE637B19B0C}">
-  <ds:schemaRefs>
-    <ds:schemaRef ds:uri="http://schemas.microsoft.com/sharepoint/v3/contenttype/forms"/>
-  </ds:schemaRefs>
-</ds:datastoreItem>
 </file>
</xml_diff>

<commit_message>
added zones dim and locations dim, fixed ER diagram
</commit_message>
<xml_diff>
--- a/dwh_design/Business_Template.docx
+++ b/dwh_design/Business_Template.docx
@@ -15297,34 +15297,64 @@
         <w:ind w:left="720"/>
       </w:pPr>
       <w:r>
+        <w:rPr/>
         <w:t xml:space="preserve">PRODUCT_MIN_AMOUNT (catalog price) </w:t>
       </w:r>
       <w:r>
+        <w:rPr/>
         <w:t>may change</w:t>
       </w:r>
       <w:r>
+        <w:rPr/>
         <w:t xml:space="preserve"> due to seasonal promotions, markdowns, and supplier renegotiation</w:t>
       </w:r>
       <w:r>
+        <w:rPr/>
         <w:t xml:space="preserve">s. </w:t>
       </w:r>
       <w:r>
-        <w:t>Historical price versioning is required to correctly calculate gross margin and profitability for past transactions</w:t>
-      </w:r>
-      <w:r>
+        <w:rPr/>
+        <w:t xml:space="preserve">Historical price versioning is </w:t>
+      </w:r>
+      <w:r>
+        <w:rPr/>
+        <w:t>required</w:t>
+      </w:r>
+      <w:r>
+        <w:rPr/>
+        <w:t xml:space="preserve"> to correctly calculate gross margin and profitability for past transactions</w:t>
+      </w:r>
+      <w:r>
+        <w:rPr/>
         <w:t xml:space="preserve">. </w:t>
       </w:r>
       <w:r>
+        <w:rPr/>
         <w:t xml:space="preserve">Without history, all past sales would be evaluated against the current price </w:t>
       </w:r>
       <w:r>
+        <w:rPr/>
         <w:t>-</w:t>
       </w:r>
       <w:r>
+        <w:rPr/>
         <w:t xml:space="preserve"> producing incorrect financial reports</w:t>
       </w:r>
       <w:r>
+        <w:rPr/>
         <w:t>.</w:t>
+      </w:r>
+      <w:r>
+        <w:rPr/>
+        <w:t xml:space="preserve"> Also used to store past information about </w:t>
+      </w:r>
+      <w:r>
+        <w:rPr/>
+        <w:t>colour</w:t>
+      </w:r>
+      <w:r>
+        <w:rPr/>
+        <w:t>, size and description of a given product.</w:t>
       </w:r>
     </w:p>
     <w:p>
@@ -15396,23 +15426,82 @@
         <w:ind w:left="720"/>
       </w:pPr>
       <w:r>
+        <w:rPr/>
         <w:t>Employee attribute changes (address, phone, email) are administrative corrections, not business events</w:t>
       </w:r>
       <w:r>
+        <w:rPr/>
         <w:t xml:space="preserve">. </w:t>
       </w:r>
       <w:r>
+        <w:rPr/>
         <w:t>Sales analysis per employee does not require knowledge of where an employee lived at the time of a transaction</w:t>
       </w:r>
       <w:r>
+        <w:rPr/>
         <w:t xml:space="preserve">. </w:t>
       </w:r>
       <w:r>
+        <w:rPr/>
         <w:t>Source data does not contain department or store assignment attributes that would justify historical tracking</w:t>
       </w:r>
       <w:r>
+        <w:rPr/>
         <w:t>.</w:t>
       </w:r>
+    </w:p>
+    <w:p>
+      <w:pPr>
+        <w:pStyle w:val="ListBullet2"/>
+        <w:numPr>
+          <w:ilvl w:val="0"/>
+          <w:numId w:val="0"/>
+        </w:numPr>
+        <w:ind w:left="720"/>
+      </w:pPr>
+    </w:p>
+    <w:p>
+      <w:pPr>
+        <w:pStyle w:val="ListBullet"/>
+        <w:spacing w:before="60" w:after="120"/>
+        <w:contextualSpacing w:val="1"/>
+        <w:rPr/>
+      </w:pPr>
+      <w:r>
+        <w:rPr>
+          <w:b w:val="1"/>
+          <w:bCs w:val="1"/>
+        </w:rPr>
+        <w:t>CE_LOCATIONS</w:t>
+      </w:r>
+    </w:p>
+    <w:p>
+      <w:pPr>
+        <w:pStyle w:val="BodyText"/>
+        <w:ind w:firstLine="720"/>
+      </w:pPr>
+      <w:r>
+        <w:rPr/>
+        <w:t>Used to store address information</w:t>
+      </w:r>
+      <w:r>
+        <w:rPr/>
+        <w:t>, used in customers and employees</w:t>
+      </w:r>
+      <w:r>
+        <w:rPr/>
+        <w:t xml:space="preserve">. </w:t>
+      </w:r>
+    </w:p>
+    <w:p>
+      <w:pPr>
+        <w:pStyle w:val="ListBullet2"/>
+        <w:numPr>
+          <w:ilvl w:val="0"/>
+          <w:numId w:val="0"/>
+        </w:numPr>
+        <w:ind w:left="720"/>
+      </w:pPr>
     </w:p>
     <w:p>
       <w:pPr>
@@ -15591,15 +15680,46 @@
         <w:contextualSpacing/>
       </w:pPr>
       <w:r>
+        <w:rPr/>
         <w:t xml:space="preserve">Calendar attributes are </w:t>
       </w:r>
       <w:proofErr w:type="gramStart"/>
       <w:r>
+        <w:rPr/>
         <w:t>immutable by definition</w:t>
       </w:r>
       <w:proofErr w:type="gramEnd"/>
       <w:r>
+        <w:rPr/>
         <w:t>.</w:t>
+      </w:r>
+    </w:p>
+    <w:p>
+      <w:pPr>
+        <w:pStyle w:val="ListBullet"/>
+        <w:numPr>
+          <w:ilvl w:val="0"/>
+          <w:numId w:val="0"/>
+        </w:numPr>
+        <w:spacing w:before="60" w:after="120"/>
+        <w:ind w:left="720"/>
+        <w:contextualSpacing w:val="1"/>
+      </w:pPr>
+    </w:p>
+    <w:p>
+      <w:pPr>
+        <w:pStyle w:val="ListBullet"/>
+        <w:spacing w:before="60" w:after="120"/>
+        <w:ind/>
+        <w:contextualSpacing w:val="1"/>
+        <w:rPr/>
+      </w:pPr>
+      <w:r>
+        <w:rPr>
+          <w:b w:val="1"/>
+          <w:bCs w:val="1"/>
+        </w:rPr>
+        <w:t>CE_ZONES</w:t>
       </w:r>
     </w:p>
     <w:p>
@@ -15611,8 +15731,12 @@
         </w:numPr>
         <w:spacing w:before="60" w:after="120"/>
         <w:ind w:left="357" w:firstLine="363"/>
-        <w:contextualSpacing/>
-      </w:pPr>
+        <w:contextualSpacing w:val="1"/>
+      </w:pPr>
+      <w:r>
+        <w:rPr/>
+        <w:t>Fixed values of store zones (North, South, East, West)</w:t>
+      </w:r>
     </w:p>
     <w:p>
       <w:pPr>
@@ -15742,7 +15866,7 @@
       </w:tr>
       <w:tr>
         <w:trPr>
-          <w:trHeight w:val="432"/>
+          <w:trHeight w:val="300"/>
         </w:trPr>
         <w:tc>
           <w:tcPr>
@@ -16490,7 +16614,7 @@
       </w:tr>
       <w:tr>
         <w:trPr>
-          <w:trHeight w:val="432"/>
+          <w:trHeight w:val="420"/>
         </w:trPr>
         <w:tc>
           <w:tcPr>
@@ -16647,6 +16771,807 @@
             </w:pPr>
             <w:r>
               <w:t xml:space="preserve"> Source triplet </w:t>
+            </w:r>
+          </w:p>
+        </w:tc>
+      </w:tr>
+    </w:tbl>
+    <w:p>
+      <w:pPr>
+        <w:pStyle w:val="BodyText"/>
+      </w:pPr>
+    </w:p>
+    <w:p>
+      <w:pPr>
+        <w:pStyle w:val="Heading3"/>
+        <w:rPr/>
+      </w:pPr>
+      <w:r>
+        <w:rPr/>
+        <w:t xml:space="preserve">CE_LOCATIONS (SCD Type </w:t>
+      </w:r>
+      <w:r>
+        <w:rPr/>
+        <w:t>1</w:t>
+      </w:r>
+      <w:r>
+        <w:rPr/>
+        <w:t>)</w:t>
+      </w:r>
+    </w:p>
+    <w:p>
+      <w:pPr>
+        <w:pStyle w:val="BodyText"/>
+      </w:pPr>
+      <w:r>
+        <w:rPr/>
+        <w:t xml:space="preserve">Table for information about locations (city, </w:t>
+      </w:r>
+      <w:r>
+        <w:rPr/>
+        <w:t>state</w:t>
+      </w:r>
+      <w:r>
+        <w:rPr/>
+        <w:t xml:space="preserve"> and postal code are connecte</w:t>
+      </w:r>
+      <w:r>
+        <w:rPr/>
+        <w:t>d).</w:t>
+      </w:r>
+      <w:r>
+        <w:rPr/>
+        <w:t xml:space="preserve"> </w:t>
+      </w:r>
+    </w:p>
+    <w:p>
+      <w:pPr>
+        <w:pStyle w:val="Normal"/>
+      </w:pPr>
+    </w:p>
+    <w:tbl>
+      <w:tblPr>
+        <w:tblW w:w="0" w:type="auto"/>
+        <w:tblInd w:w="-5" w:type="dxa"/>
+        <w:tblBorders>
+          <w:top w:val="single" w:color="76CDD8" w:sz="4"/>
+          <w:left w:val="single" w:color="76CDD8" w:sz="4"/>
+          <w:bottom w:val="single" w:color="76CDD8" w:sz="4"/>
+          <w:right w:val="single" w:color="76CDD8" w:sz="4"/>
+          <w:insideH w:val="single" w:color="76CDD8" w:sz="4"/>
+          <w:insideV w:val="single" w:color="76CDD8" w:sz="4"/>
+        </w:tblBorders>
+        <w:tblLook w:val="0000" w:firstRow="0" w:lastRow="0" w:firstColumn="0" w:lastColumn="0" w:noHBand="0" w:noVBand="0"/>
+      </w:tblPr>
+      <w:tblGrid>
+        <w:gridCol w:w="3073"/>
+        <w:gridCol w:w="3330"/>
+        <w:gridCol w:w="2790"/>
+      </w:tblGrid>
+      <w:tr>
+        <w:trPr>
+          <w:trHeight w:val="285"/>
+        </w:trPr>
+        <w:tc>
+          <w:tcPr>
+            <w:tcW w:w="3073" w:type="dxa"/>
+            <w:shd w:val="clear" w:color="auto" w:fill="76CDD8"/>
+            <w:tcMar/>
+          </w:tcPr>
+          <w:p>
+            <w:pPr>
+              <w:pStyle w:val="Normal"/>
+              <w:widowControl w:val="0"/>
+              <w:rPr>
+                <w:rFonts w:ascii="Trebuchet MS" w:hAnsi="Trebuchet MS" w:eastAsia="Trebuchet MS" w:cs="Trebuchet MS"/>
+              </w:rPr>
+            </w:pPr>
+            <w:r>
+              <w:rPr>
+                <w:rFonts w:ascii="Trebuchet MS" w:hAnsi="Trebuchet MS" w:eastAsia="Trebuchet MS" w:cs="Trebuchet MS"/>
+              </w:rPr>
+              <w:t xml:space="preserve">Column Name </w:t>
+            </w:r>
+          </w:p>
+        </w:tc>
+        <w:tc>
+          <w:tcPr>
+            <w:tcW w:w="3330" w:type="dxa"/>
+            <w:shd w:val="clear" w:color="auto" w:fill="76CDD8"/>
+            <w:tcMar/>
+          </w:tcPr>
+          <w:p>
+            <w:pPr>
+              <w:pStyle w:val="Normal"/>
+              <w:widowControl w:val="0"/>
+              <w:rPr>
+                <w:rFonts w:ascii="Trebuchet MS" w:hAnsi="Trebuchet MS" w:eastAsia="Trebuchet MS" w:cs="Trebuchet MS"/>
+              </w:rPr>
+            </w:pPr>
+            <w:r>
+              <w:rPr>
+                <w:rFonts w:ascii="Trebuchet MS" w:hAnsi="Trebuchet MS" w:eastAsia="Trebuchet MS" w:cs="Trebuchet MS"/>
+              </w:rPr>
+              <w:t xml:space="preserve"> Data Type </w:t>
+            </w:r>
+          </w:p>
+        </w:tc>
+        <w:tc>
+          <w:tcPr>
+            <w:tcW w:w="2790" w:type="dxa"/>
+            <w:shd w:val="clear" w:color="auto" w:fill="76CDD8"/>
+            <w:tcMar/>
+          </w:tcPr>
+          <w:p>
+            <w:pPr>
+              <w:pStyle w:val="Normal"/>
+              <w:widowControl w:val="0"/>
+              <w:rPr>
+                <w:rFonts w:ascii="Trebuchet MS" w:hAnsi="Trebuchet MS" w:eastAsia="Trebuchet MS" w:cs="Trebuchet MS"/>
+              </w:rPr>
+            </w:pPr>
+            <w:r>
+              <w:rPr>
+                <w:rFonts w:ascii="Trebuchet MS" w:hAnsi="Trebuchet MS" w:eastAsia="Trebuchet MS" w:cs="Trebuchet MS"/>
+              </w:rPr>
+              <w:t xml:space="preserve"> Notes </w:t>
+            </w:r>
+          </w:p>
+        </w:tc>
+      </w:tr>
+      <w:tr>
+        <w:trPr>
+          <w:trHeight w:val="300"/>
+        </w:trPr>
+        <w:tc>
+          <w:tcPr>
+            <w:tcW w:w="3073" w:type="dxa"/>
+            <w:tcMar/>
+          </w:tcPr>
+          <w:p>
+            <w:pPr>
+              <w:pStyle w:val="Normal"/>
+              <w:rPr>
+                <w:rFonts w:ascii="Trebuchet MS" w:hAnsi="Trebuchet MS" w:eastAsia="Trebuchet MS" w:cs="Trebuchet MS"/>
+              </w:rPr>
+            </w:pPr>
+            <w:r>
+              <w:rPr>
+                <w:rFonts w:ascii="Trebuchet MS" w:hAnsi="Trebuchet MS" w:eastAsia="Trebuchet MS" w:cs="Trebuchet MS"/>
+              </w:rPr>
+              <w:t>LOCATION_ID</w:t>
+            </w:r>
+          </w:p>
+        </w:tc>
+        <w:tc>
+          <w:tcPr>
+            <w:tcW w:w="3330" w:type="dxa"/>
+            <w:tcMar/>
+          </w:tcPr>
+          <w:p>
+            <w:pPr>
+              <w:pStyle w:val="Normal"/>
+              <w:rPr>
+                <w:rFonts w:ascii="Trebuchet MS" w:hAnsi="Trebuchet MS" w:eastAsia="Trebuchet MS" w:cs="Trebuchet MS"/>
+              </w:rPr>
+            </w:pPr>
+            <w:r>
+              <w:rPr>
+                <w:rFonts w:ascii="Trebuchet MS" w:hAnsi="Trebuchet MS" w:eastAsia="Trebuchet MS" w:cs="Trebuchet MS"/>
+              </w:rPr>
+              <w:t>BIGINT NOT NULL</w:t>
+            </w:r>
+          </w:p>
+        </w:tc>
+        <w:tc>
+          <w:tcPr>
+            <w:tcW w:w="2790" w:type="dxa"/>
+            <w:tcMar/>
+          </w:tcPr>
+          <w:p>
+            <w:pPr>
+              <w:pStyle w:val="Normal"/>
+            </w:pPr>
+            <w:r>
+              <w:rPr>
+                <w:rFonts w:ascii="Trebuchet MS" w:hAnsi="Trebuchet MS" w:eastAsia="Trebuchet MS" w:cs="Trebuchet MS"/>
+              </w:rPr>
+              <w:t>PK</w:t>
+            </w:r>
+            <w:r>
+              <w:rPr>
+                <w:rFonts w:ascii="Trebuchet MS" w:hAnsi="Trebuchet MS" w:eastAsia="Trebuchet MS" w:cs="Trebuchet MS"/>
+              </w:rPr>
+              <w:t xml:space="preserve"> – generated sequence</w:t>
+            </w:r>
+          </w:p>
+        </w:tc>
+      </w:tr>
+      <w:tr>
+        <w:trPr>
+          <w:trHeight w:val="432"/>
+        </w:trPr>
+        <w:tc>
+          <w:tcPr>
+            <w:tcW w:w="3073" w:type="dxa"/>
+            <w:tcMar/>
+          </w:tcPr>
+          <w:p>
+            <w:pPr>
+              <w:pStyle w:val="Normal"/>
+              <w:rPr>
+                <w:rFonts w:ascii="Trebuchet MS" w:hAnsi="Trebuchet MS" w:eastAsia="Trebuchet MS" w:cs="Trebuchet MS"/>
+              </w:rPr>
+            </w:pPr>
+            <w:r>
+              <w:rPr>
+                <w:rFonts w:ascii="Trebuchet MS" w:hAnsi="Trebuchet MS" w:eastAsia="Trebuchet MS" w:cs="Trebuchet MS"/>
+              </w:rPr>
+              <w:t>LOCATION_SRC_ID</w:t>
+            </w:r>
+          </w:p>
+        </w:tc>
+        <w:tc>
+          <w:tcPr>
+            <w:tcW w:w="3330" w:type="dxa"/>
+            <w:tcMar/>
+          </w:tcPr>
+          <w:p>
+            <w:pPr>
+              <w:pStyle w:val="Normal"/>
+              <w:rPr>
+                <w:rFonts w:ascii="Trebuchet MS" w:hAnsi="Trebuchet MS" w:eastAsia="Trebuchet MS" w:cs="Trebuchet MS"/>
+              </w:rPr>
+            </w:pPr>
+            <w:r>
+              <w:rPr>
+                <w:rFonts w:ascii="Trebuchet MS" w:hAnsi="Trebuchet MS" w:eastAsia="Trebuchet MS" w:cs="Trebuchet MS"/>
+              </w:rPr>
+              <w:t>VARCHAR(100) NOT NULL</w:t>
+            </w:r>
+          </w:p>
+        </w:tc>
+        <w:tc>
+          <w:tcPr>
+            <w:tcW w:w="2790" w:type="dxa"/>
+            <w:tcMar/>
+          </w:tcPr>
+          <w:p>
+            <w:pPr>
+              <w:pStyle w:val="Normal"/>
+              <w:rPr>
+                <w:rFonts w:ascii="Trebuchet MS" w:hAnsi="Trebuchet MS" w:eastAsia="Trebuchet MS" w:cs="Trebuchet MS"/>
+              </w:rPr>
+            </w:pPr>
+            <w:r>
+              <w:rPr>
+                <w:rFonts w:ascii="Trebuchet MS" w:hAnsi="Trebuchet MS" w:eastAsia="Trebuchet MS" w:cs="Trebuchet MS"/>
+              </w:rPr>
+              <w:t>NK — generated from address components</w:t>
+            </w:r>
+          </w:p>
+        </w:tc>
+      </w:tr>
+      <w:tr>
+        <w:trPr>
+          <w:trHeight w:val="432"/>
+        </w:trPr>
+        <w:tc>
+          <w:tcPr>
+            <w:tcW w:w="3073" w:type="dxa"/>
+            <w:tcMar/>
+          </w:tcPr>
+          <w:p>
+            <w:pPr>
+              <w:pStyle w:val="Normal"/>
+              <w:rPr>
+                <w:rFonts w:ascii="Trebuchet MS" w:hAnsi="Trebuchet MS" w:eastAsia="Trebuchet MS" w:cs="Trebuchet MS"/>
+              </w:rPr>
+            </w:pPr>
+            <w:r>
+              <w:rPr>
+                <w:rFonts w:ascii="Trebuchet MS" w:hAnsi="Trebuchet MS" w:eastAsia="Trebuchet MS" w:cs="Trebuchet MS"/>
+              </w:rPr>
+              <w:t>LOCATION_ADDRESS</w:t>
+            </w:r>
+          </w:p>
+        </w:tc>
+        <w:tc>
+          <w:tcPr>
+            <w:tcW w:w="3330" w:type="dxa"/>
+            <w:tcMar/>
+          </w:tcPr>
+          <w:p>
+            <w:pPr>
+              <w:pStyle w:val="Normal"/>
+              <w:rPr>
+                <w:rFonts w:ascii="Trebuchet MS" w:hAnsi="Trebuchet MS" w:eastAsia="Trebuchet MS" w:cs="Trebuchet MS"/>
+              </w:rPr>
+            </w:pPr>
+            <w:r>
+              <w:rPr>
+                <w:rFonts w:ascii="Trebuchet MS" w:hAnsi="Trebuchet MS" w:eastAsia="Trebuchet MS" w:cs="Trebuchet MS"/>
+              </w:rPr>
+              <w:t>VARCHAR(200) NOT NULL</w:t>
+            </w:r>
+          </w:p>
+        </w:tc>
+        <w:tc>
+          <w:tcPr>
+            <w:tcW w:w="2790" w:type="dxa"/>
+            <w:tcMar/>
+          </w:tcPr>
+          <w:p>
+            <w:pPr>
+              <w:pStyle w:val="Normal"/>
+              <w:rPr>
+                <w:rFonts w:ascii="Trebuchet MS" w:hAnsi="Trebuchet MS" w:eastAsia="Trebuchet MS" w:cs="Trebuchet MS"/>
+              </w:rPr>
+            </w:pPr>
+            <w:r>
+              <w:rPr>
+                <w:rFonts w:ascii="Trebuchet MS" w:hAnsi="Trebuchet MS" w:eastAsia="Trebuchet MS" w:cs="Trebuchet MS"/>
+              </w:rPr>
+              <w:t>Street address</w:t>
+            </w:r>
+          </w:p>
+        </w:tc>
+      </w:tr>
+      <w:tr>
+        <w:trPr>
+          <w:trHeight w:val="432"/>
+        </w:trPr>
+        <w:tc>
+          <w:tcPr>
+            <w:tcW w:w="3073" w:type="dxa"/>
+            <w:tcMar/>
+          </w:tcPr>
+          <w:p>
+            <w:pPr>
+              <w:pStyle w:val="Normal"/>
+              <w:rPr>
+                <w:rFonts w:ascii="Trebuchet MS" w:hAnsi="Trebuchet MS" w:eastAsia="Trebuchet MS" w:cs="Trebuchet MS"/>
+              </w:rPr>
+            </w:pPr>
+            <w:r>
+              <w:rPr>
+                <w:rFonts w:ascii="Trebuchet MS" w:hAnsi="Trebuchet MS" w:eastAsia="Trebuchet MS" w:cs="Trebuchet MS"/>
+              </w:rPr>
+              <w:t>LOCATION_POSTAL_CODE</w:t>
+            </w:r>
+          </w:p>
+        </w:tc>
+        <w:tc>
+          <w:tcPr>
+            <w:tcW w:w="3330" w:type="dxa"/>
+            <w:tcMar/>
+          </w:tcPr>
+          <w:p>
+            <w:pPr>
+              <w:pStyle w:val="Normal"/>
+              <w:rPr>
+                <w:rFonts w:ascii="Trebuchet MS" w:hAnsi="Trebuchet MS" w:eastAsia="Trebuchet MS" w:cs="Trebuchet MS"/>
+              </w:rPr>
+            </w:pPr>
+            <w:r>
+              <w:rPr>
+                <w:rFonts w:ascii="Trebuchet MS" w:hAnsi="Trebuchet MS" w:eastAsia="Trebuchet MS" w:cs="Trebuchet MS"/>
+              </w:rPr>
+              <w:t>VARCHAR(10) NOT NULL</w:t>
+            </w:r>
+          </w:p>
+        </w:tc>
+        <w:tc>
+          <w:tcPr>
+            <w:tcW w:w="2790" w:type="dxa"/>
+            <w:tcMar/>
+          </w:tcPr>
+          <w:p>
+            <w:pPr>
+              <w:pStyle w:val="Normal"/>
+              <w:rPr>
+                <w:rFonts w:ascii="Trebuchet MS" w:hAnsi="Trebuchet MS" w:eastAsia="Trebuchet MS" w:cs="Trebuchet MS"/>
+              </w:rPr>
+            </w:pPr>
+            <w:r>
+              <w:rPr>
+                <w:rFonts w:ascii="Trebuchet MS" w:hAnsi="Trebuchet MS" w:eastAsia="Trebuchet MS" w:cs="Trebuchet MS"/>
+              </w:rPr>
+              <w:t>Postal code — determinant of city and state</w:t>
+            </w:r>
+          </w:p>
+        </w:tc>
+      </w:tr>
+      <w:tr>
+        <w:trPr>
+          <w:trHeight w:val="432"/>
+        </w:trPr>
+        <w:tc>
+          <w:tcPr>
+            <w:tcW w:w="3073" w:type="dxa"/>
+            <w:tcMar/>
+          </w:tcPr>
+          <w:p>
+            <w:pPr>
+              <w:pStyle w:val="Normal"/>
+              <w:rPr>
+                <w:rFonts w:ascii="Trebuchet MS" w:hAnsi="Trebuchet MS" w:eastAsia="Trebuchet MS" w:cs="Trebuchet MS"/>
+              </w:rPr>
+            </w:pPr>
+            <w:r>
+              <w:rPr>
+                <w:rFonts w:ascii="Trebuchet MS" w:hAnsi="Trebuchet MS" w:eastAsia="Trebuchet MS" w:cs="Trebuchet MS"/>
+              </w:rPr>
+              <w:t>LOCATION_CITY</w:t>
+            </w:r>
+          </w:p>
+        </w:tc>
+        <w:tc>
+          <w:tcPr>
+            <w:tcW w:w="3330" w:type="dxa"/>
+            <w:tcMar/>
+          </w:tcPr>
+          <w:p>
+            <w:pPr>
+              <w:pStyle w:val="Normal"/>
+              <w:rPr>
+                <w:rFonts w:ascii="Trebuchet MS" w:hAnsi="Trebuchet MS" w:eastAsia="Trebuchet MS" w:cs="Trebuchet MS"/>
+              </w:rPr>
+            </w:pPr>
+            <w:r>
+              <w:rPr>
+                <w:rFonts w:ascii="Trebuchet MS" w:hAnsi="Trebuchet MS" w:eastAsia="Trebuchet MS" w:cs="Trebuchet MS"/>
+              </w:rPr>
+              <w:t>VARCHAR(100) NOT NULL</w:t>
+            </w:r>
+          </w:p>
+        </w:tc>
+        <w:tc>
+          <w:tcPr>
+            <w:tcW w:w="2790" w:type="dxa"/>
+            <w:tcMar/>
+          </w:tcPr>
+          <w:p>
+            <w:pPr>
+              <w:pStyle w:val="Normal"/>
+              <w:rPr>
+                <w:rFonts w:ascii="Trebuchet MS" w:hAnsi="Trebuchet MS" w:eastAsia="Trebuchet MS" w:cs="Trebuchet MS"/>
+              </w:rPr>
+            </w:pPr>
+            <w:r>
+              <w:rPr>
+                <w:rFonts w:ascii="Trebuchet MS" w:hAnsi="Trebuchet MS" w:eastAsia="Trebuchet MS" w:cs="Trebuchet MS"/>
+              </w:rPr>
+              <w:t>City — determined by postal code</w:t>
+            </w:r>
+          </w:p>
+        </w:tc>
+      </w:tr>
+      <w:tr>
+        <w:trPr>
+          <w:trHeight w:val="432"/>
+        </w:trPr>
+        <w:tc>
+          <w:tcPr>
+            <w:tcW w:w="3073" w:type="dxa"/>
+            <w:tcMar/>
+          </w:tcPr>
+          <w:p>
+            <w:pPr>
+              <w:pStyle w:val="Normal"/>
+              <w:rPr>
+                <w:rFonts w:ascii="Trebuchet MS" w:hAnsi="Trebuchet MS" w:eastAsia="Trebuchet MS" w:cs="Trebuchet MS"/>
+              </w:rPr>
+            </w:pPr>
+            <w:r>
+              <w:rPr>
+                <w:rFonts w:ascii="Trebuchet MS" w:hAnsi="Trebuchet MS" w:eastAsia="Trebuchet MS" w:cs="Trebuchet MS"/>
+              </w:rPr>
+              <w:t>LOCATION_STATE</w:t>
+            </w:r>
+          </w:p>
+        </w:tc>
+        <w:tc>
+          <w:tcPr>
+            <w:tcW w:w="3330" w:type="dxa"/>
+            <w:tcMar/>
+          </w:tcPr>
+          <w:p>
+            <w:pPr>
+              <w:pStyle w:val="Normal"/>
+              <w:rPr>
+                <w:rFonts w:ascii="Trebuchet MS" w:hAnsi="Trebuchet MS" w:eastAsia="Trebuchet MS" w:cs="Trebuchet MS"/>
+              </w:rPr>
+            </w:pPr>
+            <w:r>
+              <w:rPr>
+                <w:rFonts w:ascii="Trebuchet MS" w:hAnsi="Trebuchet MS" w:eastAsia="Trebuchet MS" w:cs="Trebuchet MS"/>
+              </w:rPr>
+              <w:t>CHAR(2) NOT NULL</w:t>
+            </w:r>
+          </w:p>
+        </w:tc>
+        <w:tc>
+          <w:tcPr>
+            <w:tcW w:w="2790" w:type="dxa"/>
+            <w:tcMar/>
+          </w:tcPr>
+          <w:p>
+            <w:pPr>
+              <w:pStyle w:val="Normal"/>
+              <w:rPr>
+                <w:rFonts w:ascii="Trebuchet MS" w:hAnsi="Trebuchet MS" w:eastAsia="Trebuchet MS" w:cs="Trebuchet MS"/>
+              </w:rPr>
+            </w:pPr>
+            <w:r>
+              <w:rPr>
+                <w:rFonts w:ascii="Trebuchet MS" w:hAnsi="Trebuchet MS" w:eastAsia="Trebuchet MS" w:cs="Trebuchet MS"/>
+              </w:rPr>
+              <w:t>State code — determined by postal code</w:t>
+            </w:r>
+          </w:p>
+        </w:tc>
+      </w:tr>
+      <w:tr>
+        <w:trPr>
+          <w:trHeight w:val="432"/>
+        </w:trPr>
+        <w:tc>
+          <w:tcPr>
+            <w:tcW w:w="3073" w:type="dxa"/>
+            <w:tcMar/>
+          </w:tcPr>
+          <w:p>
+            <w:pPr>
+              <w:pStyle w:val="BodyText"/>
+            </w:pPr>
+            <w:r>
+              <w:rPr/>
+              <w:t xml:space="preserve"> </w:t>
+            </w:r>
+            <w:r>
+              <w:rPr/>
+              <w:t>TA_INSERT_DT</w:t>
+            </w:r>
+            <w:r>
+              <w:rPr/>
+              <w:t xml:space="preserve"> </w:t>
+            </w:r>
+          </w:p>
+        </w:tc>
+        <w:tc>
+          <w:tcPr>
+            <w:tcW w:w="3330" w:type="dxa"/>
+            <w:tcMar/>
+          </w:tcPr>
+          <w:p>
+            <w:pPr>
+              <w:pStyle w:val="BodyText"/>
+            </w:pPr>
+            <w:r>
+              <w:rPr/>
+              <w:t xml:space="preserve"> DATE NOT NULL </w:t>
+            </w:r>
+          </w:p>
+        </w:tc>
+        <w:tc>
+          <w:tcPr>
+            <w:tcW w:w="2790" w:type="dxa"/>
+            <w:tcMar/>
+          </w:tcPr>
+          <w:p>
+            <w:pPr>
+              <w:pStyle w:val="BodyText"/>
+            </w:pPr>
+            <w:r>
+              <w:rPr/>
+              <w:t xml:space="preserve"> Row creation date </w:t>
+            </w:r>
+          </w:p>
+        </w:tc>
+      </w:tr>
+      <w:tr>
+        <w:trPr>
+          <w:trHeight w:val="432"/>
+        </w:trPr>
+        <w:tc>
+          <w:tcPr>
+            <w:tcW w:w="3073" w:type="dxa"/>
+            <w:tcMar/>
+          </w:tcPr>
+          <w:p>
+            <w:pPr>
+              <w:pStyle w:val="BodyText"/>
+            </w:pPr>
+            <w:r>
+              <w:rPr/>
+              <w:t xml:space="preserve"> </w:t>
+            </w:r>
+            <w:r>
+              <w:rPr/>
+              <w:t>TA_UPDATE_DT</w:t>
+            </w:r>
+            <w:r>
+              <w:rPr/>
+              <w:t xml:space="preserve"> </w:t>
+            </w:r>
+          </w:p>
+        </w:tc>
+        <w:tc>
+          <w:tcPr>
+            <w:tcW w:w="3330" w:type="dxa"/>
+            <w:tcMar/>
+          </w:tcPr>
+          <w:p>
+            <w:pPr>
+              <w:pStyle w:val="BodyText"/>
+            </w:pPr>
+            <w:r>
+              <w:rPr/>
+              <w:t xml:space="preserve"> DATE NOT NULL </w:t>
+            </w:r>
+          </w:p>
+        </w:tc>
+        <w:tc>
+          <w:tcPr>
+            <w:tcW w:w="2790" w:type="dxa"/>
+            <w:tcMar/>
+          </w:tcPr>
+          <w:p>
+            <w:pPr>
+              <w:pStyle w:val="BodyText"/>
+            </w:pPr>
+            <w:r>
+              <w:rPr/>
+              <w:t xml:space="preserve"> Last update date </w:t>
+            </w:r>
+          </w:p>
+        </w:tc>
+      </w:tr>
+      <w:tr>
+        <w:trPr>
+          <w:trHeight w:val="432"/>
+        </w:trPr>
+        <w:tc>
+          <w:tcPr>
+            <w:tcW w:w="3073" w:type="dxa"/>
+            <w:tcMar/>
+          </w:tcPr>
+          <w:p>
+            <w:pPr>
+              <w:spacing w:before="0" w:beforeAutospacing="off" w:after="0" w:afterAutospacing="off"/>
+              <w:jc w:val="left"/>
+              <w:rPr>
+                <w:rFonts w:ascii="Trebuchet MS" w:hAnsi="Trebuchet MS" w:eastAsia="Trebuchet MS" w:cs="Trebuchet MS"/>
+                <w:b w:val="0"/>
+                <w:bCs w:val="0"/>
+              </w:rPr>
+            </w:pPr>
+            <w:r>
+              <w:rPr>
+                <w:rFonts w:ascii="Trebuchet MS" w:hAnsi="Trebuchet MS" w:eastAsia="Trebuchet MS" w:cs="Trebuchet MS"/>
+                <w:b w:val="0"/>
+                <w:bCs w:val="0"/>
+              </w:rPr>
+              <w:t>SOURCE_SYSTEM</w:t>
+            </w:r>
+          </w:p>
+        </w:tc>
+        <w:tc>
+          <w:tcPr>
+            <w:tcW w:w="3330" w:type="dxa"/>
+            <w:tcMar/>
+          </w:tcPr>
+          <w:p>
+            <w:pPr>
+              <w:spacing w:before="0" w:beforeAutospacing="off" w:after="0" w:afterAutospacing="off"/>
+              <w:jc w:val="left"/>
+              <w:rPr>
+                <w:rFonts w:ascii="Trebuchet MS" w:hAnsi="Trebuchet MS" w:eastAsia="Trebuchet MS" w:cs="Trebuchet MS"/>
+                <w:b w:val="0"/>
+                <w:bCs w:val="0"/>
+              </w:rPr>
+            </w:pPr>
+            <w:r>
+              <w:rPr>
+                <w:rFonts w:ascii="Trebuchet MS" w:hAnsi="Trebuchet MS" w:eastAsia="Trebuchet MS" w:cs="Trebuchet MS"/>
+                <w:b w:val="0"/>
+                <w:bCs w:val="0"/>
+              </w:rPr>
+              <w:t>VARCHAR(50) NOT NULL</w:t>
+            </w:r>
+          </w:p>
+        </w:tc>
+        <w:tc>
+          <w:tcPr>
+            <w:tcW w:w="2790" w:type="dxa"/>
+            <w:tcMar/>
+          </w:tcPr>
+          <w:p>
+            <w:pPr>
+              <w:spacing w:before="0" w:beforeAutospacing="off" w:after="0" w:afterAutospacing="off"/>
+              <w:jc w:val="left"/>
+              <w:rPr>
+                <w:rFonts w:ascii="Trebuchet MS" w:hAnsi="Trebuchet MS" w:eastAsia="Trebuchet MS" w:cs="Trebuchet MS"/>
+                <w:b w:val="0"/>
+                <w:bCs w:val="0"/>
+              </w:rPr>
+            </w:pPr>
+            <w:r>
+              <w:rPr>
+                <w:rFonts w:ascii="Trebuchet MS" w:hAnsi="Trebuchet MS" w:eastAsia="Trebuchet MS" w:cs="Trebuchet MS"/>
+                <w:b w:val="0"/>
+                <w:bCs w:val="0"/>
+              </w:rPr>
+              <w:t>Source triplet</w:t>
+            </w:r>
+          </w:p>
+        </w:tc>
+      </w:tr>
+      <w:tr>
+        <w:trPr>
+          <w:trHeight w:val="432"/>
+        </w:trPr>
+        <w:tc>
+          <w:tcPr>
+            <w:tcW w:w="3073" w:type="dxa"/>
+            <w:tcMar/>
+          </w:tcPr>
+          <w:p>
+            <w:pPr>
+              <w:spacing w:before="0" w:beforeAutospacing="off" w:after="0" w:afterAutospacing="off"/>
+              <w:jc w:val="left"/>
+              <w:rPr>
+                <w:rFonts w:ascii="Trebuchet MS" w:hAnsi="Trebuchet MS" w:eastAsia="Trebuchet MS" w:cs="Trebuchet MS"/>
+              </w:rPr>
+            </w:pPr>
+            <w:r>
+              <w:rPr>
+                <w:rFonts w:ascii="Trebuchet MS" w:hAnsi="Trebuchet MS" w:eastAsia="Trebuchet MS" w:cs="Trebuchet MS"/>
+              </w:rPr>
+              <w:t>SOURCE_ENTITY</w:t>
+            </w:r>
+          </w:p>
+        </w:tc>
+        <w:tc>
+          <w:tcPr>
+            <w:tcW w:w="3330" w:type="dxa"/>
+            <w:tcMar/>
+          </w:tcPr>
+          <w:p>
+            <w:pPr>
+              <w:spacing w:before="0" w:beforeAutospacing="off" w:after="0" w:afterAutospacing="off"/>
+              <w:jc w:val="left"/>
+              <w:rPr>
+                <w:rFonts w:ascii="Trebuchet MS" w:hAnsi="Trebuchet MS" w:eastAsia="Trebuchet MS" w:cs="Trebuchet MS"/>
+              </w:rPr>
+            </w:pPr>
+            <w:r>
+              <w:rPr>
+                <w:rFonts w:ascii="Trebuchet MS" w:hAnsi="Trebuchet MS" w:eastAsia="Trebuchet MS" w:cs="Trebuchet MS"/>
+              </w:rPr>
+              <w:t>VARCHAR(50) NOT NULL</w:t>
+            </w:r>
+          </w:p>
+        </w:tc>
+        <w:tc>
+          <w:tcPr>
+            <w:tcW w:w="2790" w:type="dxa"/>
+            <w:tcMar/>
+          </w:tcPr>
+          <w:p>
+            <w:pPr>
+              <w:spacing w:before="0" w:beforeAutospacing="off" w:after="0" w:afterAutospacing="off"/>
+              <w:jc w:val="left"/>
+              <w:rPr>
+                <w:rFonts w:ascii="Trebuchet MS" w:hAnsi="Trebuchet MS" w:eastAsia="Trebuchet MS" w:cs="Trebuchet MS"/>
+              </w:rPr>
+            </w:pPr>
+            <w:r>
+              <w:rPr>
+                <w:rFonts w:ascii="Trebuchet MS" w:hAnsi="Trebuchet MS" w:eastAsia="Trebuchet MS" w:cs="Trebuchet MS"/>
+              </w:rPr>
+              <w:t>Source triplet</w:t>
             </w:r>
           </w:p>
         </w:tc>
@@ -17118,7 +18043,12 @@
               <w:pStyle w:val="BodyText"/>
             </w:pPr>
             <w:r>
-              <w:t xml:space="preserve"> CUSTOMER_ADDRESS </w:t>
+              <w:rPr/>
+              <w:t xml:space="preserve"> CUSTOMER_</w:t>
+            </w:r>
+            <w:r>
+              <w:rPr/>
+              <w:t>LOCATION_ID</w:t>
             </w:r>
           </w:p>
         </w:tc>
@@ -17130,17 +18060,19 @@
           <w:p>
             <w:pPr>
               <w:pStyle w:val="BodyText"/>
-            </w:pPr>
-            <w:r>
+              <w:suppressLineNumbers w:val="0"/>
+              <w:bidi w:val="0"/>
+              <w:spacing w:before="120" w:beforeAutospacing="off" w:after="0" w:afterAutospacing="off" w:line="240" w:lineRule="auto"/>
+              <w:ind w:left="0" w:right="0"/>
+              <w:jc w:val="left"/>
+            </w:pPr>
+            <w:r>
+              <w:rPr/>
+              <w:t xml:space="preserve"> BIGINT NOT NULL</w:t>
+            </w:r>
+            <w:r>
+              <w:rPr/>
               <w:t xml:space="preserve"> </w:t>
-            </w:r>
-            <w:proofErr w:type="gramStart"/>
-            <w:r>
-              <w:t>VARCHAR(</w:t>
-            </w:r>
-            <w:proofErr w:type="gramEnd"/>
-            <w:r>
-              <w:t xml:space="preserve">200) NOT NULL </w:t>
             </w:r>
           </w:p>
         </w:tc>
@@ -17154,172 +18086,8 @@
               <w:pStyle w:val="BodyText"/>
             </w:pPr>
             <w:r>
-              <w:t xml:space="preserve"> Street address </w:t>
-            </w:r>
-          </w:p>
-        </w:tc>
-      </w:tr>
-      <w:tr>
-        <w:trPr>
-          <w:trHeight w:val="432"/>
-        </w:trPr>
-        <w:tc>
-          <w:tcPr>
-            <w:tcW w:w="3073" w:type="dxa"/>
-            <w:tcMar/>
-          </w:tcPr>
-          <w:p>
-            <w:pPr>
-              <w:pStyle w:val="BodyText"/>
-            </w:pPr>
-            <w:r>
-              <w:t xml:space="preserve"> CUSTOMER_CITY </w:t>
-            </w:r>
-          </w:p>
-        </w:tc>
-        <w:tc>
-          <w:tcPr>
-            <w:tcW w:w="3330" w:type="dxa"/>
-            <w:tcMar/>
-          </w:tcPr>
-          <w:p>
-            <w:pPr>
-              <w:pStyle w:val="BodyText"/>
-            </w:pPr>
-            <w:r>
-              <w:t xml:space="preserve"> </w:t>
-            </w:r>
-            <w:proofErr w:type="gramStart"/>
-            <w:r>
-              <w:t>VARCHAR(</w:t>
-            </w:r>
-            <w:proofErr w:type="gramEnd"/>
-            <w:r>
-              <w:t xml:space="preserve">100) NOT NULL </w:t>
-            </w:r>
-          </w:p>
-        </w:tc>
-        <w:tc>
-          <w:tcPr>
-            <w:tcW w:w="2790" w:type="dxa"/>
-            <w:tcMar/>
-          </w:tcPr>
-          <w:p>
-            <w:pPr>
-              <w:pStyle w:val="BodyText"/>
-            </w:pPr>
-            <w:r>
-              <w:t xml:space="preserve"> City </w:t>
-            </w:r>
-          </w:p>
-        </w:tc>
-      </w:tr>
-      <w:tr>
-        <w:trPr>
-          <w:trHeight w:val="432"/>
-        </w:trPr>
-        <w:tc>
-          <w:tcPr>
-            <w:tcW w:w="3073" w:type="dxa"/>
-            <w:tcMar/>
-          </w:tcPr>
-          <w:p>
-            <w:pPr>
-              <w:pStyle w:val="BodyText"/>
-            </w:pPr>
-            <w:r>
-              <w:t xml:space="preserve"> CUSTOMER_STATE </w:t>
-            </w:r>
-          </w:p>
-        </w:tc>
-        <w:tc>
-          <w:tcPr>
-            <w:tcW w:w="3330" w:type="dxa"/>
-            <w:tcMar/>
-          </w:tcPr>
-          <w:p>
-            <w:pPr>
-              <w:pStyle w:val="BodyText"/>
-            </w:pPr>
-            <w:r>
-              <w:t xml:space="preserve"> </w:t>
-            </w:r>
-            <w:proofErr w:type="gramStart"/>
-            <w:r>
-              <w:t>CHAR(</w:t>
-            </w:r>
-            <w:proofErr w:type="gramEnd"/>
-            <w:r>
-              <w:t xml:space="preserve">2) NOT NULL </w:t>
-            </w:r>
-          </w:p>
-        </w:tc>
-        <w:tc>
-          <w:tcPr>
-            <w:tcW w:w="2790" w:type="dxa"/>
-            <w:tcMar/>
-          </w:tcPr>
-          <w:p>
-            <w:pPr>
-              <w:pStyle w:val="BodyText"/>
-            </w:pPr>
-            <w:r>
-              <w:t xml:space="preserve"> State code </w:t>
-            </w:r>
-          </w:p>
-        </w:tc>
-      </w:tr>
-      <w:tr>
-        <w:trPr>
-          <w:trHeight w:val="432"/>
-        </w:trPr>
-        <w:tc>
-          <w:tcPr>
-            <w:tcW w:w="3073" w:type="dxa"/>
-            <w:tcMar/>
-          </w:tcPr>
-          <w:p>
-            <w:pPr>
-              <w:pStyle w:val="BodyText"/>
-            </w:pPr>
-            <w:r>
-              <w:t xml:space="preserve"> CUSTOMER_POSTAL_CODE </w:t>
-            </w:r>
-          </w:p>
-        </w:tc>
-        <w:tc>
-          <w:tcPr>
-            <w:tcW w:w="3330" w:type="dxa"/>
-            <w:tcMar/>
-          </w:tcPr>
-          <w:p>
-            <w:pPr>
-              <w:pStyle w:val="BodyText"/>
-            </w:pPr>
-            <w:r>
-              <w:t xml:space="preserve"> </w:t>
-            </w:r>
-            <w:proofErr w:type="gramStart"/>
-            <w:r>
-              <w:t>VARCHAR(</w:t>
-            </w:r>
-            <w:proofErr w:type="gramEnd"/>
-            <w:r>
-              <w:t xml:space="preserve">10) NOT NULL </w:t>
-            </w:r>
-          </w:p>
-        </w:tc>
-        <w:tc>
-          <w:tcPr>
-            <w:tcW w:w="2790" w:type="dxa"/>
-            <w:tcMar/>
-          </w:tcPr>
-          <w:p>
-            <w:pPr>
-              <w:pStyle w:val="BodyText"/>
-            </w:pPr>
-            <w:r>
-              <w:t xml:space="preserve"> Postal code </w:t>
+              <w:rPr/>
+              <w:t>FK → CE_LOCATIONS (logical only — no DB constraint!)</w:t>
             </w:r>
           </w:p>
         </w:tc>
@@ -17721,6 +18489,7 @@
           <w:tcPr>
             <w:tcW w:w="3073" w:type="dxa"/>
             <w:shd w:val="clear" w:color="auto" w:fill="76CDD8"/>
+            <w:tcMar/>
           </w:tcPr>
           <w:p>
             <w:pPr>
@@ -17743,6 +18512,7 @@
           <w:tcPr>
             <w:tcW w:w="3330" w:type="dxa"/>
             <w:shd w:val="clear" w:color="auto" w:fill="76CDD8"/>
+            <w:tcMar/>
           </w:tcPr>
           <w:p>
             <w:pPr>
@@ -17765,6 +18535,7 @@
           <w:tcPr>
             <w:tcW w:w="2790" w:type="dxa"/>
             <w:shd w:val="clear" w:color="auto" w:fill="76CDD8"/>
+            <w:tcMar/>
           </w:tcPr>
           <w:p>
             <w:pPr>
@@ -17790,6 +18561,7 @@
         <w:tc>
           <w:tcPr>
             <w:tcW w:w="3073" w:type="dxa"/>
+            <w:tcMar/>
           </w:tcPr>
           <w:p>
             <w:pPr>
@@ -17803,6 +18575,7 @@
         <w:tc>
           <w:tcPr>
             <w:tcW w:w="3330" w:type="dxa"/>
+            <w:tcMar/>
           </w:tcPr>
           <w:p>
             <w:pPr>
@@ -17816,6 +18589,7 @@
         <w:tc>
           <w:tcPr>
             <w:tcW w:w="2790" w:type="dxa"/>
+            <w:tcMar/>
           </w:tcPr>
           <w:p>
             <w:pPr>
@@ -17834,6 +18608,7 @@
         <w:tc>
           <w:tcPr>
             <w:tcW w:w="3073" w:type="dxa"/>
+            <w:tcMar/>
           </w:tcPr>
           <w:p>
             <w:pPr>
@@ -17847,6 +18622,7 @@
         <w:tc>
           <w:tcPr>
             <w:tcW w:w="3330" w:type="dxa"/>
+            <w:tcMar/>
           </w:tcPr>
           <w:p>
             <w:pPr>
@@ -17868,6 +18644,7 @@
         <w:tc>
           <w:tcPr>
             <w:tcW w:w="2790" w:type="dxa"/>
+            <w:tcMar/>
           </w:tcPr>
           <w:p>
             <w:pPr>
@@ -17902,6 +18679,7 @@
         <w:tc>
           <w:tcPr>
             <w:tcW w:w="3073" w:type="dxa"/>
+            <w:tcMar/>
           </w:tcPr>
           <w:p>
             <w:pPr>
@@ -17915,6 +18693,7 @@
         <w:tc>
           <w:tcPr>
             <w:tcW w:w="3330" w:type="dxa"/>
+            <w:tcMar/>
           </w:tcPr>
           <w:p>
             <w:pPr>
@@ -17936,6 +18715,7 @@
         <w:tc>
           <w:tcPr>
             <w:tcW w:w="2790" w:type="dxa"/>
+            <w:tcMar/>
           </w:tcPr>
           <w:p>
             <w:pPr>
@@ -17954,6 +18734,7 @@
         <w:tc>
           <w:tcPr>
             <w:tcW w:w="3073" w:type="dxa"/>
+            <w:tcMar/>
           </w:tcPr>
           <w:p>
             <w:pPr>
@@ -17967,6 +18748,7 @@
         <w:tc>
           <w:tcPr>
             <w:tcW w:w="3330" w:type="dxa"/>
+            <w:tcMar/>
           </w:tcPr>
           <w:p>
             <w:pPr>
@@ -17988,6 +18770,7 @@
         <w:tc>
           <w:tcPr>
             <w:tcW w:w="2790" w:type="dxa"/>
+            <w:tcMar/>
           </w:tcPr>
           <w:p>
             <w:pPr>
@@ -18006,6 +18789,7 @@
         <w:tc>
           <w:tcPr>
             <w:tcW w:w="3073" w:type="dxa"/>
+            <w:tcMar/>
           </w:tcPr>
           <w:p>
             <w:pPr>
@@ -18019,6 +18803,7 @@
         <w:tc>
           <w:tcPr>
             <w:tcW w:w="3330" w:type="dxa"/>
+            <w:tcMar/>
           </w:tcPr>
           <w:p>
             <w:pPr>
@@ -18040,6 +18825,7 @@
         <w:tc>
           <w:tcPr>
             <w:tcW w:w="2790" w:type="dxa"/>
+            <w:tcMar/>
           </w:tcPr>
           <w:p>
             <w:pPr>
@@ -18058,6 +18844,7 @@
         <w:tc>
           <w:tcPr>
             <w:tcW w:w="3073" w:type="dxa"/>
+            <w:tcMar/>
           </w:tcPr>
           <w:p>
             <w:pPr>
@@ -18071,6 +18858,7 @@
         <w:tc>
           <w:tcPr>
             <w:tcW w:w="3330" w:type="dxa"/>
+            <w:tcMar/>
           </w:tcPr>
           <w:p>
             <w:pPr>
@@ -18092,6 +18880,7 @@
         <w:tc>
           <w:tcPr>
             <w:tcW w:w="2790" w:type="dxa"/>
+            <w:tcMar/>
           </w:tcPr>
           <w:p>
             <w:pPr>
@@ -18110,47 +18899,62 @@
         <w:tc>
           <w:tcPr>
             <w:tcW w:w="3073" w:type="dxa"/>
-          </w:tcPr>
-          <w:p>
-            <w:pPr>
-              <w:pStyle w:val="BodyText"/>
-            </w:pPr>
-            <w:r>
-              <w:t xml:space="preserve"> EMPLOYEE_ADDRESS </w:t>
+            <w:tcMar/>
+          </w:tcPr>
+          <w:p>
+            <w:pPr>
+              <w:pStyle w:val="BodyText"/>
+            </w:pPr>
+            <w:r>
+              <w:rPr/>
+              <w:t xml:space="preserve"> </w:t>
+            </w:r>
+            <w:r>
+              <w:rPr/>
+              <w:t>EMPLOYEE</w:t>
+            </w:r>
+            <w:r>
+              <w:rPr/>
+              <w:t>_LOCATION_ID</w:t>
             </w:r>
           </w:p>
         </w:tc>
         <w:tc>
           <w:tcPr>
             <w:tcW w:w="3330" w:type="dxa"/>
-          </w:tcPr>
-          <w:p>
-            <w:pPr>
-              <w:pStyle w:val="BodyText"/>
-            </w:pPr>
-            <w:r>
+            <w:tcMar/>
+          </w:tcPr>
+          <w:p>
+            <w:pPr>
+              <w:pStyle w:val="BodyText"/>
+              <w:suppressLineNumbers w:val="0"/>
+              <w:bidi w:val="0"/>
+              <w:spacing w:before="120" w:beforeAutospacing="off" w:after="0" w:afterAutospacing="off" w:line="240" w:lineRule="auto"/>
+              <w:ind w:left="0" w:right="0"/>
+              <w:jc w:val="left"/>
+            </w:pPr>
+            <w:r>
+              <w:rPr/>
+              <w:t xml:space="preserve"> BIGINT NOT NULL</w:t>
+            </w:r>
+            <w:r>
+              <w:rPr/>
               <w:t xml:space="preserve"> </w:t>
             </w:r>
-            <w:proofErr w:type="gramStart"/>
-            <w:r>
-              <w:t>VARCHAR(</w:t>
-            </w:r>
-            <w:proofErr w:type="gramEnd"/>
-            <w:r>
-              <w:t xml:space="preserve">200) NOT NULL </w:t>
-            </w:r>
           </w:p>
         </w:tc>
         <w:tc>
           <w:tcPr>
             <w:tcW w:w="2790" w:type="dxa"/>
-          </w:tcPr>
-          <w:p>
-            <w:pPr>
-              <w:pStyle w:val="BodyText"/>
-            </w:pPr>
-            <w:r>
-              <w:t xml:space="preserve"> Street address </w:t>
+            <w:tcMar/>
+          </w:tcPr>
+          <w:p>
+            <w:pPr>
+              <w:pStyle w:val="BodyText"/>
+            </w:pPr>
+            <w:r>
+              <w:rPr/>
+              <w:t>FK → CE_LOCATIONS</w:t>
             </w:r>
           </w:p>
         </w:tc>
@@ -18162,47 +18966,48 @@
         <w:tc>
           <w:tcPr>
             <w:tcW w:w="3073" w:type="dxa"/>
-          </w:tcPr>
-          <w:p>
-            <w:pPr>
-              <w:pStyle w:val="BodyText"/>
-            </w:pPr>
-            <w:r>
-              <w:t xml:space="preserve"> EMPLOYEE_CITY </w:t>
+            <w:tcMar/>
+          </w:tcPr>
+          <w:p>
+            <w:pPr>
+              <w:pStyle w:val="BodyText"/>
+            </w:pPr>
+            <w:r>
+              <w:t xml:space="preserve"> </w:t>
+            </w:r>
+            <w:r>
+              <w:t>TA_INSERT_DT</w:t>
+            </w:r>
+            <w:r>
+              <w:t xml:space="preserve"> </w:t>
             </w:r>
           </w:p>
         </w:tc>
         <w:tc>
           <w:tcPr>
             <w:tcW w:w="3330" w:type="dxa"/>
-          </w:tcPr>
-          <w:p>
-            <w:pPr>
-              <w:pStyle w:val="BodyText"/>
-            </w:pPr>
-            <w:r>
-              <w:t xml:space="preserve"> </w:t>
-            </w:r>
-            <w:proofErr w:type="gramStart"/>
-            <w:r>
-              <w:t>VARCHAR(</w:t>
-            </w:r>
-            <w:proofErr w:type="gramEnd"/>
-            <w:r>
-              <w:t xml:space="preserve">100) NOT NULL </w:t>
+            <w:tcMar/>
+          </w:tcPr>
+          <w:p>
+            <w:pPr>
+              <w:pStyle w:val="BodyText"/>
+            </w:pPr>
+            <w:r>
+              <w:t xml:space="preserve"> DATE NOT NULL </w:t>
             </w:r>
           </w:p>
         </w:tc>
         <w:tc>
           <w:tcPr>
             <w:tcW w:w="2790" w:type="dxa"/>
-          </w:tcPr>
-          <w:p>
-            <w:pPr>
-              <w:pStyle w:val="BodyText"/>
-            </w:pPr>
-            <w:r>
-              <w:t xml:space="preserve"> City </w:t>
+            <w:tcMar/>
+          </w:tcPr>
+          <w:p>
+            <w:pPr>
+              <w:pStyle w:val="BodyText"/>
+            </w:pPr>
+            <w:r>
+              <w:t xml:space="preserve"> Row creation date </w:t>
             </w:r>
           </w:p>
         </w:tc>
@@ -18214,47 +19019,48 @@
         <w:tc>
           <w:tcPr>
             <w:tcW w:w="3073" w:type="dxa"/>
-          </w:tcPr>
-          <w:p>
-            <w:pPr>
-              <w:pStyle w:val="BodyText"/>
-            </w:pPr>
-            <w:r>
-              <w:t xml:space="preserve"> EMPLOYEE_STATE </w:t>
+            <w:tcMar/>
+          </w:tcPr>
+          <w:p>
+            <w:pPr>
+              <w:pStyle w:val="BodyText"/>
+            </w:pPr>
+            <w:r>
+              <w:t xml:space="preserve"> </w:t>
+            </w:r>
+            <w:r>
+              <w:t>TA_UPDATE_DT</w:t>
+            </w:r>
+            <w:r>
+              <w:t xml:space="preserve"> </w:t>
             </w:r>
           </w:p>
         </w:tc>
         <w:tc>
           <w:tcPr>
             <w:tcW w:w="3330" w:type="dxa"/>
-          </w:tcPr>
-          <w:p>
-            <w:pPr>
-              <w:pStyle w:val="BodyText"/>
-            </w:pPr>
-            <w:r>
-              <w:t xml:space="preserve"> </w:t>
-            </w:r>
-            <w:proofErr w:type="gramStart"/>
-            <w:r>
-              <w:t>CHAR(</w:t>
-            </w:r>
-            <w:proofErr w:type="gramEnd"/>
-            <w:r>
-              <w:t xml:space="preserve">2) NOT NULL </w:t>
+            <w:tcMar/>
+          </w:tcPr>
+          <w:p>
+            <w:pPr>
+              <w:pStyle w:val="BodyText"/>
+            </w:pPr>
+            <w:r>
+              <w:t xml:space="preserve"> DATE NOT NULL </w:t>
             </w:r>
           </w:p>
         </w:tc>
         <w:tc>
           <w:tcPr>
             <w:tcW w:w="2790" w:type="dxa"/>
-          </w:tcPr>
-          <w:p>
-            <w:pPr>
-              <w:pStyle w:val="BodyText"/>
-            </w:pPr>
-            <w:r>
-              <w:t xml:space="preserve"> State code </w:t>
+            <w:tcMar/>
+          </w:tcPr>
+          <w:p>
+            <w:pPr>
+              <w:pStyle w:val="BodyText"/>
+            </w:pPr>
+            <w:r>
+              <w:t xml:space="preserve"> Last update date </w:t>
             </w:r>
           </w:p>
         </w:tc>
@@ -18266,19 +19072,21 @@
         <w:tc>
           <w:tcPr>
             <w:tcW w:w="3073" w:type="dxa"/>
-          </w:tcPr>
-          <w:p>
-            <w:pPr>
-              <w:pStyle w:val="BodyText"/>
-            </w:pPr>
-            <w:r>
-              <w:t xml:space="preserve"> EMPLOYEE_POSTAL_CODE </w:t>
+            <w:tcMar/>
+          </w:tcPr>
+          <w:p>
+            <w:pPr>
+              <w:pStyle w:val="BodyText"/>
+            </w:pPr>
+            <w:r>
+              <w:t xml:space="preserve"> SOURCE_SYSTEM </w:t>
             </w:r>
           </w:p>
         </w:tc>
         <w:tc>
           <w:tcPr>
             <w:tcW w:w="3330" w:type="dxa"/>
+            <w:tcMar/>
           </w:tcPr>
           <w:p>
             <w:pPr>
@@ -18293,20 +19101,21 @@
             </w:r>
             <w:proofErr w:type="gramEnd"/>
             <w:r>
-              <w:t xml:space="preserve">10) NOT NULL </w:t>
+              <w:t xml:space="preserve">50) NOT NULL </w:t>
             </w:r>
           </w:p>
         </w:tc>
         <w:tc>
           <w:tcPr>
             <w:tcW w:w="2790" w:type="dxa"/>
-          </w:tcPr>
-          <w:p>
-            <w:pPr>
-              <w:pStyle w:val="BodyText"/>
-            </w:pPr>
-            <w:r>
-              <w:t xml:space="preserve"> Postal code </w:t>
+            <w:tcMar/>
+          </w:tcPr>
+          <w:p>
+            <w:pPr>
+              <w:pStyle w:val="BodyText"/>
+            </w:pPr>
+            <w:r>
+              <w:t xml:space="preserve"> Source triplet </w:t>
             </w:r>
           </w:p>
         </w:tc>
@@ -18318,6 +19127,21 @@
         <w:tc>
           <w:tcPr>
             <w:tcW w:w="3073" w:type="dxa"/>
+            <w:tcMar/>
+          </w:tcPr>
+          <w:p>
+            <w:pPr>
+              <w:pStyle w:val="BodyText"/>
+            </w:pPr>
+            <w:r>
+              <w:t xml:space="preserve"> SOURCE_ENTITY </w:t>
+            </w:r>
+          </w:p>
+        </w:tc>
+        <w:tc>
+          <w:tcPr>
+            <w:tcW w:w="3330" w:type="dxa"/>
+            <w:tcMar/>
           </w:tcPr>
           <w:p>
             <w:pPr>
@@ -18326,184 +19150,20 @@
             <w:r>
               <w:t xml:space="preserve"> </w:t>
             </w:r>
-            <w:r>
-              <w:t>TA_INSERT_DT</w:t>
-            </w:r>
-            <w:r>
-              <w:t xml:space="preserve"> </w:t>
-            </w:r>
-          </w:p>
-        </w:tc>
-        <w:tc>
-          <w:tcPr>
-            <w:tcW w:w="3330" w:type="dxa"/>
-          </w:tcPr>
-          <w:p>
-            <w:pPr>
-              <w:pStyle w:val="BodyText"/>
-            </w:pPr>
-            <w:r>
-              <w:t xml:space="preserve"> DATE NOT NULL </w:t>
+            <w:proofErr w:type="gramStart"/>
+            <w:r>
+              <w:t>VARCHAR(</w:t>
+            </w:r>
+            <w:proofErr w:type="gramEnd"/>
+            <w:r>
+              <w:t xml:space="preserve">50) NOT NULL </w:t>
             </w:r>
           </w:p>
         </w:tc>
         <w:tc>
           <w:tcPr>
             <w:tcW w:w="2790" w:type="dxa"/>
-          </w:tcPr>
-          <w:p>
-            <w:pPr>
-              <w:pStyle w:val="BodyText"/>
-            </w:pPr>
-            <w:r>
-              <w:t xml:space="preserve"> Row creation date </w:t>
-            </w:r>
-          </w:p>
-        </w:tc>
-      </w:tr>
-      <w:tr>
-        <w:trPr>
-          <w:trHeight w:val="432"/>
-        </w:trPr>
-        <w:tc>
-          <w:tcPr>
-            <w:tcW w:w="3073" w:type="dxa"/>
-          </w:tcPr>
-          <w:p>
-            <w:pPr>
-              <w:pStyle w:val="BodyText"/>
-            </w:pPr>
-            <w:r>
-              <w:t xml:space="preserve"> </w:t>
-            </w:r>
-            <w:r>
-              <w:t>TA_UPDATE_DT</w:t>
-            </w:r>
-            <w:r>
-              <w:t xml:space="preserve"> </w:t>
-            </w:r>
-          </w:p>
-        </w:tc>
-        <w:tc>
-          <w:tcPr>
-            <w:tcW w:w="3330" w:type="dxa"/>
-          </w:tcPr>
-          <w:p>
-            <w:pPr>
-              <w:pStyle w:val="BodyText"/>
-            </w:pPr>
-            <w:r>
-              <w:t xml:space="preserve"> DATE NOT NULL </w:t>
-            </w:r>
-          </w:p>
-        </w:tc>
-        <w:tc>
-          <w:tcPr>
-            <w:tcW w:w="2790" w:type="dxa"/>
-          </w:tcPr>
-          <w:p>
-            <w:pPr>
-              <w:pStyle w:val="BodyText"/>
-            </w:pPr>
-            <w:r>
-              <w:t xml:space="preserve"> Last update date </w:t>
-            </w:r>
-          </w:p>
-        </w:tc>
-      </w:tr>
-      <w:tr>
-        <w:trPr>
-          <w:trHeight w:val="432"/>
-        </w:trPr>
-        <w:tc>
-          <w:tcPr>
-            <w:tcW w:w="3073" w:type="dxa"/>
-          </w:tcPr>
-          <w:p>
-            <w:pPr>
-              <w:pStyle w:val="BodyText"/>
-            </w:pPr>
-            <w:r>
-              <w:t xml:space="preserve"> SOURCE_SYSTEM </w:t>
-            </w:r>
-          </w:p>
-        </w:tc>
-        <w:tc>
-          <w:tcPr>
-            <w:tcW w:w="3330" w:type="dxa"/>
-          </w:tcPr>
-          <w:p>
-            <w:pPr>
-              <w:pStyle w:val="BodyText"/>
-            </w:pPr>
-            <w:r>
-              <w:t xml:space="preserve"> </w:t>
-            </w:r>
-            <w:proofErr w:type="gramStart"/>
-            <w:r>
-              <w:t>VARCHAR(</w:t>
-            </w:r>
-            <w:proofErr w:type="gramEnd"/>
-            <w:r>
-              <w:t xml:space="preserve">50) NOT NULL </w:t>
-            </w:r>
-          </w:p>
-        </w:tc>
-        <w:tc>
-          <w:tcPr>
-            <w:tcW w:w="2790" w:type="dxa"/>
-          </w:tcPr>
-          <w:p>
-            <w:pPr>
-              <w:pStyle w:val="BodyText"/>
-            </w:pPr>
-            <w:r>
-              <w:t xml:space="preserve"> Source triplet </w:t>
-            </w:r>
-          </w:p>
-        </w:tc>
-      </w:tr>
-      <w:tr>
-        <w:trPr>
-          <w:trHeight w:val="432"/>
-        </w:trPr>
-        <w:tc>
-          <w:tcPr>
-            <w:tcW w:w="3073" w:type="dxa"/>
-          </w:tcPr>
-          <w:p>
-            <w:pPr>
-              <w:pStyle w:val="BodyText"/>
-            </w:pPr>
-            <w:r>
-              <w:t xml:space="preserve"> SOURCE_ENTITY </w:t>
-            </w:r>
-          </w:p>
-        </w:tc>
-        <w:tc>
-          <w:tcPr>
-            <w:tcW w:w="3330" w:type="dxa"/>
-          </w:tcPr>
-          <w:p>
-            <w:pPr>
-              <w:pStyle w:val="BodyText"/>
-            </w:pPr>
-            <w:r>
-              <w:t xml:space="preserve"> </w:t>
-            </w:r>
-            <w:proofErr w:type="gramStart"/>
-            <w:r>
-              <w:t>VARCHAR(</w:t>
-            </w:r>
-            <w:proofErr w:type="gramEnd"/>
-            <w:r>
-              <w:t xml:space="preserve">50) NOT NULL </w:t>
-            </w:r>
-          </w:p>
-        </w:tc>
-        <w:tc>
-          <w:tcPr>
-            <w:tcW w:w="2790" w:type="dxa"/>
+            <w:tcMar/>
           </w:tcPr>
           <w:p>
             <w:pPr>
@@ -21185,6 +21845,7 @@
           <w:tcPr>
             <w:tcW w:w="3073" w:type="dxa"/>
             <w:shd w:val="clear" w:color="auto" w:fill="76CDD8"/>
+            <w:tcMar/>
           </w:tcPr>
           <w:p>
             <w:pPr>
@@ -21207,6 +21868,7 @@
           <w:tcPr>
             <w:tcW w:w="3330" w:type="dxa"/>
             <w:shd w:val="clear" w:color="auto" w:fill="76CDD8"/>
+            <w:tcMar/>
           </w:tcPr>
           <w:p>
             <w:pPr>
@@ -21229,6 +21891,7 @@
           <w:tcPr>
             <w:tcW w:w="2790" w:type="dxa"/>
             <w:shd w:val="clear" w:color="auto" w:fill="76CDD8"/>
+            <w:tcMar/>
           </w:tcPr>
           <w:p>
             <w:pPr>
@@ -21254,6 +21917,7 @@
         <w:tc>
           <w:tcPr>
             <w:tcW w:w="3073" w:type="dxa"/>
+            <w:tcMar/>
           </w:tcPr>
           <w:p>
             <w:pPr>
@@ -21267,6 +21931,7 @@
         <w:tc>
           <w:tcPr>
             <w:tcW w:w="3330" w:type="dxa"/>
+            <w:tcMar/>
           </w:tcPr>
           <w:p>
             <w:pPr>
@@ -21280,6 +21945,7 @@
         <w:tc>
           <w:tcPr>
             <w:tcW w:w="2790" w:type="dxa"/>
+            <w:tcMar/>
           </w:tcPr>
           <w:p>
             <w:pPr>
@@ -21298,6 +21964,7 @@
         <w:tc>
           <w:tcPr>
             <w:tcW w:w="3073" w:type="dxa"/>
+            <w:tcMar/>
           </w:tcPr>
           <w:p>
             <w:pPr>
@@ -21311,6 +21978,7 @@
         <w:tc>
           <w:tcPr>
             <w:tcW w:w="3330" w:type="dxa"/>
+            <w:tcMar/>
           </w:tcPr>
           <w:p>
             <w:pPr>
@@ -21332,6 +22000,7 @@
         <w:tc>
           <w:tcPr>
             <w:tcW w:w="2790" w:type="dxa"/>
+            <w:tcMar/>
           </w:tcPr>
           <w:p>
             <w:pPr>
@@ -21358,6 +22027,7 @@
         <w:tc>
           <w:tcPr>
             <w:tcW w:w="3073" w:type="dxa"/>
+            <w:tcMar/>
           </w:tcPr>
           <w:p>
             <w:pPr>
@@ -21371,6 +22041,7 @@
         <w:tc>
           <w:tcPr>
             <w:tcW w:w="3330" w:type="dxa"/>
+            <w:tcMar/>
           </w:tcPr>
           <w:p>
             <w:pPr>
@@ -21392,6 +22063,7 @@
         <w:tc>
           <w:tcPr>
             <w:tcW w:w="2790" w:type="dxa"/>
+            <w:tcMar/>
           </w:tcPr>
           <w:p>
             <w:pPr>
@@ -21410,47 +22082,57 @@
         <w:tc>
           <w:tcPr>
             <w:tcW w:w="3073" w:type="dxa"/>
-          </w:tcPr>
-          <w:p>
-            <w:pPr>
-              <w:pStyle w:val="BodyText"/>
-            </w:pPr>
-            <w:r>
-              <w:t xml:space="preserve"> STORE_ZONE_CODE </w:t>
+            <w:tcMar/>
+          </w:tcPr>
+          <w:p>
+            <w:pPr>
+              <w:pStyle w:val="BodyText"/>
+            </w:pPr>
+            <w:r>
+              <w:rPr/>
+              <w:t xml:space="preserve"> STORE_ZONE_</w:t>
+            </w:r>
+            <w:r>
+              <w:rPr/>
+              <w:t>ID</w:t>
             </w:r>
           </w:p>
         </w:tc>
         <w:tc>
           <w:tcPr>
             <w:tcW w:w="3330" w:type="dxa"/>
-          </w:tcPr>
-          <w:p>
-            <w:pPr>
-              <w:pStyle w:val="BodyText"/>
-            </w:pPr>
-            <w:r>
+            <w:tcMar/>
+          </w:tcPr>
+          <w:p>
+            <w:pPr>
+              <w:pStyle w:val="BodyText"/>
+            </w:pPr>
+            <w:r>
+              <w:rPr/>
+              <w:t xml:space="preserve"> BIGINT NOT NULL</w:t>
+            </w:r>
+            <w:r>
+              <w:rPr/>
               <w:t xml:space="preserve"> </w:t>
             </w:r>
-            <w:proofErr w:type="gramStart"/>
-            <w:r>
-              <w:t>VARCHAR(</w:t>
-            </w:r>
-            <w:proofErr w:type="gramEnd"/>
-            <w:r>
-              <w:t xml:space="preserve">50) NOT NULL </w:t>
-            </w:r>
           </w:p>
         </w:tc>
         <w:tc>
           <w:tcPr>
             <w:tcW w:w="2790" w:type="dxa"/>
-          </w:tcPr>
-          <w:p>
-            <w:pPr>
-              <w:pStyle w:val="BodyText"/>
-            </w:pPr>
-            <w:r>
-              <w:t xml:space="preserve"> South / East / West / North / N/A </w:t>
+            <w:tcMar/>
+          </w:tcPr>
+          <w:p>
+            <w:pPr>
+              <w:pStyle w:val="BodyText"/>
+            </w:pPr>
+            <w:r>
+              <w:rPr/>
+              <w:t xml:space="preserve"> </w:t>
+            </w:r>
+            <w:r>
+              <w:rPr/>
+              <w:t>FK → CE_STORE_ZONES</w:t>
             </w:r>
           </w:p>
         </w:tc>
@@ -21462,55 +22144,58 @@
         <w:tc>
           <w:tcPr>
             <w:tcW w:w="3073" w:type="dxa"/>
-          </w:tcPr>
-          <w:p>
-            <w:pPr>
-              <w:pStyle w:val="BodyText"/>
-            </w:pPr>
-            <w:r>
-              <w:t xml:space="preserve"> STORE_ADDRESS </w:t>
+            <w:tcMar/>
+          </w:tcPr>
+          <w:p>
+            <w:pPr>
+              <w:pStyle w:val="BodyText"/>
+            </w:pPr>
+            <w:r>
+              <w:rPr/>
+              <w:t>STOR</w:t>
+            </w:r>
+            <w:r>
+              <w:rPr/>
+              <w:t>E_LOCATION_ID</w:t>
             </w:r>
           </w:p>
         </w:tc>
         <w:tc>
           <w:tcPr>
             <w:tcW w:w="3330" w:type="dxa"/>
-          </w:tcPr>
-          <w:p>
-            <w:pPr>
-              <w:pStyle w:val="BodyText"/>
-            </w:pPr>
-            <w:r>
+            <w:tcMar/>
+          </w:tcPr>
+          <w:p>
+            <w:pPr>
+              <w:pStyle w:val="BodyText"/>
+              <w:suppressLineNumbers w:val="0"/>
+              <w:bidi w:val="0"/>
+              <w:spacing w:before="120" w:beforeAutospacing="off" w:after="0" w:afterAutospacing="off" w:line="240" w:lineRule="auto"/>
+              <w:ind w:left="0" w:right="0"/>
+              <w:jc w:val="left"/>
+            </w:pPr>
+            <w:r>
+              <w:rPr/>
+              <w:t xml:space="preserve"> BIGINT NOT NULL</w:t>
+            </w:r>
+            <w:r>
+              <w:rPr/>
               <w:t xml:space="preserve"> </w:t>
             </w:r>
-            <w:proofErr w:type="gramStart"/>
-            <w:r>
-              <w:t>VARCHAR(</w:t>
-            </w:r>
-            <w:proofErr w:type="gramEnd"/>
-            <w:r>
-              <w:t xml:space="preserve">200) NOT NULL </w:t>
-            </w:r>
           </w:p>
         </w:tc>
         <w:tc>
           <w:tcPr>
             <w:tcW w:w="2790" w:type="dxa"/>
-          </w:tcPr>
-          <w:p>
-            <w:pPr>
-              <w:pStyle w:val="BodyText"/>
-            </w:pPr>
-            <w:r>
-              <w:t xml:space="preserve"> N/A for </w:t>
-            </w:r>
-            <w:proofErr w:type="spellStart"/>
-            <w:r>
-              <w:t>ecom</w:t>
-            </w:r>
-            <w:proofErr w:type="spellEnd"/>
-            <w:r>
-              <w:t xml:space="preserve"> </w:t>
+            <w:tcMar/>
+          </w:tcPr>
+          <w:p>
+            <w:pPr>
+              <w:pStyle w:val="BodyText"/>
+            </w:pPr>
+            <w:r>
+              <w:rPr/>
+              <w:t>FK → CE_LOCATIONS</w:t>
             </w:r>
           </w:p>
         </w:tc>
@@ -21522,53 +22207,46 @@
         <w:tc>
           <w:tcPr>
             <w:tcW w:w="3073" w:type="dxa"/>
-          </w:tcPr>
-          <w:p>
-            <w:pPr>
-              <w:pStyle w:val="BodyText"/>
-            </w:pPr>
-            <w:r>
-              <w:t xml:space="preserve"> STORE_CITY </w:t>
+            <w:tcMar/>
+          </w:tcPr>
+          <w:p>
+            <w:pPr>
+              <w:pStyle w:val="BodyText"/>
+            </w:pPr>
+            <w:r>
+              <w:t xml:space="preserve"> </w:t>
+            </w:r>
+            <w:r>
+              <w:t>TA_INSERT_DT</w:t>
+            </w:r>
+            <w:r>
+              <w:t xml:space="preserve"> </w:t>
             </w:r>
           </w:p>
         </w:tc>
         <w:tc>
           <w:tcPr>
             <w:tcW w:w="3330" w:type="dxa"/>
-          </w:tcPr>
-          <w:p>
-            <w:pPr>
-              <w:pStyle w:val="BodyText"/>
-            </w:pPr>
-            <w:r>
-              <w:t xml:space="preserve"> </w:t>
-            </w:r>
-            <w:proofErr w:type="gramStart"/>
-            <w:r>
-              <w:t>VARCHAR(</w:t>
-            </w:r>
-            <w:proofErr w:type="gramEnd"/>
-            <w:r>
-              <w:t xml:space="preserve">100) NOT NULL </w:t>
+            <w:tcMar/>
+          </w:tcPr>
+          <w:p>
+            <w:pPr>
+              <w:pStyle w:val="BodyText"/>
+            </w:pPr>
+            <w:r>
+              <w:t xml:space="preserve"> DATE NOT NULL </w:t>
             </w:r>
           </w:p>
         </w:tc>
         <w:tc>
           <w:tcPr>
             <w:tcW w:w="2790" w:type="dxa"/>
-          </w:tcPr>
-          <w:p>
-            <w:pPr>
-              <w:pStyle w:val="BodyText"/>
-            </w:pPr>
-            <w:r>
-              <w:t xml:space="preserve"> N/A for </w:t>
-            </w:r>
-            <w:proofErr w:type="spellStart"/>
-            <w:r>
-              <w:t>ecom</w:t>
-            </w:r>
-            <w:proofErr w:type="spellEnd"/>
+            <w:tcMar/>
+          </w:tcPr>
+          <w:p>
+            <w:pPr>
+              <w:pStyle w:val="BodyText"/>
+            </w:pPr>
             <w:r>
               <w:t xml:space="preserve"> </w:t>
             </w:r>
@@ -21582,53 +22260,46 @@
         <w:tc>
           <w:tcPr>
             <w:tcW w:w="3073" w:type="dxa"/>
-          </w:tcPr>
-          <w:p>
-            <w:pPr>
-              <w:pStyle w:val="BodyText"/>
-            </w:pPr>
-            <w:r>
-              <w:t xml:space="preserve"> STORE_STATE </w:t>
+            <w:tcMar/>
+          </w:tcPr>
+          <w:p>
+            <w:pPr>
+              <w:pStyle w:val="BodyText"/>
+            </w:pPr>
+            <w:r>
+              <w:t xml:space="preserve"> </w:t>
+            </w:r>
+            <w:r>
+              <w:t>TA_UPDATE_DT</w:t>
+            </w:r>
+            <w:r>
+              <w:t xml:space="preserve"> </w:t>
             </w:r>
           </w:p>
         </w:tc>
         <w:tc>
           <w:tcPr>
             <w:tcW w:w="3330" w:type="dxa"/>
-          </w:tcPr>
-          <w:p>
-            <w:pPr>
-              <w:pStyle w:val="BodyText"/>
-            </w:pPr>
-            <w:r>
-              <w:t xml:space="preserve"> </w:t>
-            </w:r>
-            <w:proofErr w:type="gramStart"/>
-            <w:r>
-              <w:t>CHAR(</w:t>
-            </w:r>
-            <w:proofErr w:type="gramEnd"/>
-            <w:r>
-              <w:t xml:space="preserve">2) NOT NULL </w:t>
+            <w:tcMar/>
+          </w:tcPr>
+          <w:p>
+            <w:pPr>
+              <w:pStyle w:val="BodyText"/>
+            </w:pPr>
+            <w:r>
+              <w:t xml:space="preserve"> DATE NOT NULL </w:t>
             </w:r>
           </w:p>
         </w:tc>
         <w:tc>
           <w:tcPr>
             <w:tcW w:w="2790" w:type="dxa"/>
-          </w:tcPr>
-          <w:p>
-            <w:pPr>
-              <w:pStyle w:val="BodyText"/>
-            </w:pPr>
-            <w:r>
-              <w:t xml:space="preserve"> N/A for </w:t>
-            </w:r>
-            <w:proofErr w:type="spellStart"/>
-            <w:r>
-              <w:t>ecom</w:t>
-            </w:r>
-            <w:proofErr w:type="spellEnd"/>
+            <w:tcMar/>
+          </w:tcPr>
+          <w:p>
+            <w:pPr>
+              <w:pStyle w:val="BodyText"/>
+            </w:pPr>
             <w:r>
               <w:t xml:space="preserve"> </w:t>
             </w:r>
@@ -21642,19 +22313,21 @@
         <w:tc>
           <w:tcPr>
             <w:tcW w:w="3073" w:type="dxa"/>
-          </w:tcPr>
-          <w:p>
-            <w:pPr>
-              <w:pStyle w:val="BodyText"/>
-            </w:pPr>
-            <w:r>
-              <w:t xml:space="preserve"> STORE_POSTAL_CODE </w:t>
+            <w:tcMar/>
+          </w:tcPr>
+          <w:p>
+            <w:pPr>
+              <w:pStyle w:val="BodyText"/>
+            </w:pPr>
+            <w:r>
+              <w:t xml:space="preserve"> SOURCE_SYSTEM </w:t>
             </w:r>
           </w:p>
         </w:tc>
         <w:tc>
           <w:tcPr>
             <w:tcW w:w="3330" w:type="dxa"/>
+            <w:tcMar/>
           </w:tcPr>
           <w:p>
             <w:pPr>
@@ -21669,26 +22342,19 @@
             </w:r>
             <w:proofErr w:type="gramEnd"/>
             <w:r>
-              <w:t xml:space="preserve">10) NOT NULL </w:t>
+              <w:t xml:space="preserve">50) NOT NULL </w:t>
             </w:r>
           </w:p>
         </w:tc>
         <w:tc>
           <w:tcPr>
             <w:tcW w:w="2790" w:type="dxa"/>
-          </w:tcPr>
-          <w:p>
-            <w:pPr>
-              <w:pStyle w:val="BodyText"/>
-            </w:pPr>
-            <w:r>
-              <w:t xml:space="preserve"> N/A for </w:t>
-            </w:r>
-            <w:proofErr w:type="spellStart"/>
-            <w:r>
-              <w:t>ecom</w:t>
-            </w:r>
-            <w:proofErr w:type="spellEnd"/>
+            <w:tcMar/>
+          </w:tcPr>
+          <w:p>
+            <w:pPr>
+              <w:pStyle w:val="BodyText"/>
+            </w:pPr>
             <w:r>
               <w:t xml:space="preserve"> </w:t>
             </w:r>
@@ -21702,6 +22368,21 @@
         <w:tc>
           <w:tcPr>
             <w:tcW w:w="3073" w:type="dxa"/>
+            <w:tcMar/>
+          </w:tcPr>
+          <w:p>
+            <w:pPr>
+              <w:pStyle w:val="BodyText"/>
+            </w:pPr>
+            <w:r>
+              <w:t xml:space="preserve"> SOURCE_ENTITY </w:t>
+            </w:r>
+          </w:p>
+        </w:tc>
+        <w:tc>
+          <w:tcPr>
+            <w:tcW w:w="3330" w:type="dxa"/>
+            <w:tcMar/>
           </w:tcPr>
           <w:p>
             <w:pPr>
@@ -21710,184 +22391,20 @@
             <w:r>
               <w:t xml:space="preserve"> </w:t>
             </w:r>
-            <w:r>
-              <w:t>TA_INSERT_DT</w:t>
-            </w:r>
-            <w:r>
-              <w:t xml:space="preserve"> </w:t>
-            </w:r>
-          </w:p>
-        </w:tc>
-        <w:tc>
-          <w:tcPr>
-            <w:tcW w:w="3330" w:type="dxa"/>
-          </w:tcPr>
-          <w:p>
-            <w:pPr>
-              <w:pStyle w:val="BodyText"/>
-            </w:pPr>
-            <w:r>
-              <w:t xml:space="preserve"> DATE NOT NULL </w:t>
+            <w:proofErr w:type="gramStart"/>
+            <w:r>
+              <w:t>VARCHAR(</w:t>
+            </w:r>
+            <w:proofErr w:type="gramEnd"/>
+            <w:r>
+              <w:t xml:space="preserve">50) NOT NULL </w:t>
             </w:r>
           </w:p>
         </w:tc>
         <w:tc>
           <w:tcPr>
             <w:tcW w:w="2790" w:type="dxa"/>
-          </w:tcPr>
-          <w:p>
-            <w:pPr>
-              <w:pStyle w:val="BodyText"/>
-            </w:pPr>
-            <w:r>
-              <w:t xml:space="preserve"> </w:t>
-            </w:r>
-          </w:p>
-        </w:tc>
-      </w:tr>
-      <w:tr>
-        <w:trPr>
-          <w:trHeight w:val="432"/>
-        </w:trPr>
-        <w:tc>
-          <w:tcPr>
-            <w:tcW w:w="3073" w:type="dxa"/>
-          </w:tcPr>
-          <w:p>
-            <w:pPr>
-              <w:pStyle w:val="BodyText"/>
-            </w:pPr>
-            <w:r>
-              <w:t xml:space="preserve"> </w:t>
-            </w:r>
-            <w:r>
-              <w:t>TA_UPDATE_DT</w:t>
-            </w:r>
-            <w:r>
-              <w:t xml:space="preserve"> </w:t>
-            </w:r>
-          </w:p>
-        </w:tc>
-        <w:tc>
-          <w:tcPr>
-            <w:tcW w:w="3330" w:type="dxa"/>
-          </w:tcPr>
-          <w:p>
-            <w:pPr>
-              <w:pStyle w:val="BodyText"/>
-            </w:pPr>
-            <w:r>
-              <w:t xml:space="preserve"> DATE NOT NULL </w:t>
-            </w:r>
-          </w:p>
-        </w:tc>
-        <w:tc>
-          <w:tcPr>
-            <w:tcW w:w="2790" w:type="dxa"/>
-          </w:tcPr>
-          <w:p>
-            <w:pPr>
-              <w:pStyle w:val="BodyText"/>
-            </w:pPr>
-            <w:r>
-              <w:t xml:space="preserve"> </w:t>
-            </w:r>
-          </w:p>
-        </w:tc>
-      </w:tr>
-      <w:tr>
-        <w:trPr>
-          <w:trHeight w:val="432"/>
-        </w:trPr>
-        <w:tc>
-          <w:tcPr>
-            <w:tcW w:w="3073" w:type="dxa"/>
-          </w:tcPr>
-          <w:p>
-            <w:pPr>
-              <w:pStyle w:val="BodyText"/>
-            </w:pPr>
-            <w:r>
-              <w:t xml:space="preserve"> SOURCE_SYSTEM </w:t>
-            </w:r>
-          </w:p>
-        </w:tc>
-        <w:tc>
-          <w:tcPr>
-            <w:tcW w:w="3330" w:type="dxa"/>
-          </w:tcPr>
-          <w:p>
-            <w:pPr>
-              <w:pStyle w:val="BodyText"/>
-            </w:pPr>
-            <w:r>
-              <w:t xml:space="preserve"> </w:t>
-            </w:r>
-            <w:proofErr w:type="gramStart"/>
-            <w:r>
-              <w:t>VARCHAR(</w:t>
-            </w:r>
-            <w:proofErr w:type="gramEnd"/>
-            <w:r>
-              <w:t xml:space="preserve">50) NOT NULL </w:t>
-            </w:r>
-          </w:p>
-        </w:tc>
-        <w:tc>
-          <w:tcPr>
-            <w:tcW w:w="2790" w:type="dxa"/>
-          </w:tcPr>
-          <w:p>
-            <w:pPr>
-              <w:pStyle w:val="BodyText"/>
-            </w:pPr>
-            <w:r>
-              <w:t xml:space="preserve"> </w:t>
-            </w:r>
-          </w:p>
-        </w:tc>
-      </w:tr>
-      <w:tr>
-        <w:trPr>
-          <w:trHeight w:val="432"/>
-        </w:trPr>
-        <w:tc>
-          <w:tcPr>
-            <w:tcW w:w="3073" w:type="dxa"/>
-          </w:tcPr>
-          <w:p>
-            <w:pPr>
-              <w:pStyle w:val="BodyText"/>
-            </w:pPr>
-            <w:r>
-              <w:t xml:space="preserve"> SOURCE_ENTITY </w:t>
-            </w:r>
-          </w:p>
-        </w:tc>
-        <w:tc>
-          <w:tcPr>
-            <w:tcW w:w="3330" w:type="dxa"/>
-          </w:tcPr>
-          <w:p>
-            <w:pPr>
-              <w:pStyle w:val="BodyText"/>
-            </w:pPr>
-            <w:r>
-              <w:t xml:space="preserve"> </w:t>
-            </w:r>
-            <w:proofErr w:type="gramStart"/>
-            <w:r>
-              <w:t>VARCHAR(</w:t>
-            </w:r>
-            <w:proofErr w:type="gramEnd"/>
-            <w:r>
-              <w:t xml:space="preserve">50) NOT NULL </w:t>
-            </w:r>
-          </w:p>
-        </w:tc>
-        <w:tc>
-          <w:tcPr>
-            <w:tcW w:w="2790" w:type="dxa"/>
+            <w:tcMar/>
           </w:tcPr>
           <w:p>
             <w:pPr>
@@ -23204,6 +23721,539 @@
     </w:p>
     <w:p>
       <w:pPr>
+        <w:pStyle w:val="Heading3"/>
+        <w:rPr/>
+      </w:pPr>
+      <w:r>
+        <w:rPr/>
+        <w:t>CE_STORE_ZONES (SCD Type 0)</w:t>
+      </w:r>
+    </w:p>
+    <w:p>
+      <w:pPr>
+        <w:pStyle w:val="BodyText"/>
+      </w:pPr>
+      <w:r>
+        <w:rPr/>
+        <w:t>Used to store information about store zones.</w:t>
+      </w:r>
+    </w:p>
+    <w:p>
+      <w:pPr>
+        <w:pStyle w:val="BodyText"/>
+      </w:pPr>
+    </w:p>
+    <w:tbl>
+      <w:tblPr>
+        <w:tblW w:w="0" w:type="auto"/>
+        <w:tblInd w:w="-5" w:type="dxa"/>
+        <w:tblBorders>
+          <w:top w:val="single" w:color="76CDD8" w:sz="4"/>
+          <w:left w:val="single" w:color="76CDD8" w:sz="4"/>
+          <w:bottom w:val="single" w:color="76CDD8" w:sz="4"/>
+          <w:right w:val="single" w:color="76CDD8" w:sz="4"/>
+          <w:insideH w:val="single" w:color="76CDD8" w:sz="4"/>
+          <w:insideV w:val="single" w:color="76CDD8" w:sz="4"/>
+        </w:tblBorders>
+        <w:tblLook w:val="0000" w:firstRow="0" w:lastRow="0" w:firstColumn="0" w:lastColumn="0" w:noHBand="0" w:noVBand="0"/>
+      </w:tblPr>
+      <w:tblGrid>
+        <w:gridCol w:w="3073"/>
+        <w:gridCol w:w="3330"/>
+        <w:gridCol w:w="2790"/>
+      </w:tblGrid>
+      <w:tr>
+        <w:trPr>
+          <w:trHeight w:val="292"/>
+        </w:trPr>
+        <w:tc>
+          <w:tcPr>
+            <w:tcW w:w="3073" w:type="dxa"/>
+            <w:shd w:val="clear" w:color="auto" w:fill="76CDD8"/>
+            <w:tcMar/>
+          </w:tcPr>
+          <w:p>
+            <w:pPr>
+              <w:pStyle w:val="BodyText"/>
+              <w:widowControl w:val="0"/>
+              <w:spacing w:line="360" w:lineRule="auto"/>
+              <w:jc w:val="center"/>
+              <w:rPr>
+                <w:color w:val="FFFFFF" w:themeColor="background1" w:themeTint="FF" w:themeShade="FF"/>
+                <w:sz w:val="18"/>
+                <w:szCs w:val="18"/>
+              </w:rPr>
+            </w:pPr>
+            <w:r>
+              <w:rPr/>
+              <w:t xml:space="preserve">Column Name </w:t>
+            </w:r>
+          </w:p>
+        </w:tc>
+        <w:tc>
+          <w:tcPr>
+            <w:tcW w:w="3330" w:type="dxa"/>
+            <w:shd w:val="clear" w:color="auto" w:fill="76CDD8"/>
+            <w:tcMar/>
+          </w:tcPr>
+          <w:p>
+            <w:pPr>
+              <w:pStyle w:val="BodyText"/>
+              <w:widowControl w:val="0"/>
+              <w:spacing w:line="360" w:lineRule="auto"/>
+              <w:jc w:val="center"/>
+              <w:rPr>
+                <w:color w:val="FFFFFF" w:themeColor="background1" w:themeTint="FF" w:themeShade="FF"/>
+                <w:sz w:val="18"/>
+                <w:szCs w:val="18"/>
+              </w:rPr>
+            </w:pPr>
+            <w:r>
+              <w:rPr/>
+              <w:t xml:space="preserve"> Data Type </w:t>
+            </w:r>
+          </w:p>
+        </w:tc>
+        <w:tc>
+          <w:tcPr>
+            <w:tcW w:w="2790" w:type="dxa"/>
+            <w:shd w:val="clear" w:color="auto" w:fill="76CDD8"/>
+            <w:tcMar/>
+          </w:tcPr>
+          <w:p>
+            <w:pPr>
+              <w:pStyle w:val="BodyText"/>
+              <w:widowControl w:val="0"/>
+              <w:spacing w:line="360" w:lineRule="auto"/>
+              <w:rPr>
+                <w:color w:val="FFFFFF" w:themeColor="background1" w:themeTint="FF" w:themeShade="FF"/>
+                <w:sz w:val="18"/>
+                <w:szCs w:val="18"/>
+              </w:rPr>
+            </w:pPr>
+            <w:r>
+              <w:rPr/>
+              <w:t xml:space="preserve"> Notes </w:t>
+            </w:r>
+          </w:p>
+        </w:tc>
+      </w:tr>
+      <w:tr>
+        <w:trPr>
+          <w:trHeight w:val="432"/>
+        </w:trPr>
+        <w:tc>
+          <w:tcPr>
+            <w:tcW w:w="3073" w:type="dxa"/>
+            <w:tcMar/>
+          </w:tcPr>
+          <w:p>
+            <w:pPr>
+              <w:spacing w:before="0" w:beforeAutospacing="off" w:after="0" w:afterAutospacing="off"/>
+              <w:jc w:val="left"/>
+              <w:rPr>
+                <w:rFonts w:ascii="Trebuchet MS" w:hAnsi="Trebuchet MS" w:eastAsia="Trebuchet MS" w:cs="Trebuchet MS"/>
+              </w:rPr>
+            </w:pPr>
+            <w:r>
+              <w:rPr>
+                <w:rFonts w:ascii="Trebuchet MS" w:hAnsi="Trebuchet MS" w:eastAsia="Trebuchet MS" w:cs="Trebuchet MS"/>
+              </w:rPr>
+              <w:t>STORE_ZONE_ID</w:t>
+            </w:r>
+          </w:p>
+        </w:tc>
+        <w:tc>
+          <w:tcPr>
+            <w:tcW w:w="3330" w:type="dxa"/>
+            <w:tcMar/>
+          </w:tcPr>
+          <w:p>
+            <w:pPr>
+              <w:spacing w:before="0" w:beforeAutospacing="off" w:after="0" w:afterAutospacing="off"/>
+              <w:jc w:val="left"/>
+              <w:rPr>
+                <w:rFonts w:ascii="Trebuchet MS" w:hAnsi="Trebuchet MS" w:eastAsia="Trebuchet MS" w:cs="Trebuchet MS"/>
+              </w:rPr>
+            </w:pPr>
+            <w:r>
+              <w:rPr>
+                <w:rFonts w:ascii="Trebuchet MS" w:hAnsi="Trebuchet MS" w:eastAsia="Trebuchet MS" w:cs="Trebuchet MS"/>
+              </w:rPr>
+              <w:t>BIGINT NOT NULL</w:t>
+            </w:r>
+          </w:p>
+        </w:tc>
+        <w:tc>
+          <w:tcPr>
+            <w:tcW w:w="2790" w:type="dxa"/>
+            <w:tcMar/>
+          </w:tcPr>
+          <w:p>
+            <w:pPr>
+              <w:spacing w:before="0" w:beforeAutospacing="off" w:after="0" w:afterAutospacing="off"/>
+              <w:jc w:val="left"/>
+              <w:rPr>
+                <w:rFonts w:ascii="Trebuchet MS" w:hAnsi="Trebuchet MS" w:eastAsia="Trebuchet MS" w:cs="Trebuchet MS"/>
+              </w:rPr>
+            </w:pPr>
+            <w:r>
+              <w:rPr>
+                <w:rFonts w:ascii="Trebuchet MS" w:hAnsi="Trebuchet MS" w:eastAsia="Trebuchet MS" w:cs="Trebuchet MS"/>
+              </w:rPr>
+              <w:t>PK — sequence</w:t>
+            </w:r>
+          </w:p>
+        </w:tc>
+      </w:tr>
+      <w:tr>
+        <w:trPr>
+          <w:trHeight w:val="432"/>
+        </w:trPr>
+        <w:tc>
+          <w:tcPr>
+            <w:tcW w:w="3073" w:type="dxa"/>
+            <w:tcMar/>
+          </w:tcPr>
+          <w:p>
+            <w:pPr>
+              <w:spacing w:before="0" w:beforeAutospacing="off" w:after="0" w:afterAutospacing="off"/>
+              <w:jc w:val="left"/>
+              <w:rPr>
+                <w:rFonts w:ascii="Trebuchet MS" w:hAnsi="Trebuchet MS" w:eastAsia="Trebuchet MS" w:cs="Trebuchet MS"/>
+              </w:rPr>
+            </w:pPr>
+            <w:r>
+              <w:rPr>
+                <w:rFonts w:ascii="Trebuchet MS" w:hAnsi="Trebuchet MS" w:eastAsia="Trebuchet MS" w:cs="Trebuchet MS"/>
+              </w:rPr>
+              <w:t>STORE_ZONE_SRC_ID</w:t>
+            </w:r>
+          </w:p>
+        </w:tc>
+        <w:tc>
+          <w:tcPr>
+            <w:tcW w:w="3330" w:type="dxa"/>
+            <w:tcMar/>
+          </w:tcPr>
+          <w:p>
+            <w:pPr>
+              <w:spacing w:before="0" w:beforeAutospacing="off" w:after="0" w:afterAutospacing="off"/>
+              <w:jc w:val="left"/>
+              <w:rPr>
+                <w:rFonts w:ascii="Trebuchet MS" w:hAnsi="Trebuchet MS" w:eastAsia="Trebuchet MS" w:cs="Trebuchet MS"/>
+              </w:rPr>
+            </w:pPr>
+            <w:r>
+              <w:rPr>
+                <w:rFonts w:ascii="Trebuchet MS" w:hAnsi="Trebuchet MS" w:eastAsia="Trebuchet MS" w:cs="Trebuchet MS"/>
+              </w:rPr>
+              <w:t>VARCHAR(100) NOT NULL</w:t>
+            </w:r>
+          </w:p>
+        </w:tc>
+        <w:tc>
+          <w:tcPr>
+            <w:tcW w:w="2790" w:type="dxa"/>
+            <w:tcMar/>
+          </w:tcPr>
+          <w:p>
+            <w:pPr>
+              <w:spacing w:before="0" w:beforeAutospacing="off" w:after="0" w:afterAutospacing="off"/>
+              <w:jc w:val="left"/>
+              <w:rPr>
+                <w:rFonts w:ascii="Trebuchet MS" w:hAnsi="Trebuchet MS" w:eastAsia="Trebuchet MS" w:cs="Trebuchet MS"/>
+              </w:rPr>
+            </w:pPr>
+            <w:r>
+              <w:rPr>
+                <w:rFonts w:ascii="Trebuchet MS" w:hAnsi="Trebuchet MS" w:eastAsia="Trebuchet MS" w:cs="Trebuchet MS"/>
+              </w:rPr>
+              <w:t>NK — generated from name</w:t>
+            </w:r>
+          </w:p>
+        </w:tc>
+      </w:tr>
+      <w:tr>
+        <w:trPr>
+          <w:trHeight w:val="432"/>
+        </w:trPr>
+        <w:tc>
+          <w:tcPr>
+            <w:tcW w:w="3073" w:type="dxa"/>
+            <w:tcMar/>
+          </w:tcPr>
+          <w:p>
+            <w:pPr>
+              <w:spacing w:before="0" w:beforeAutospacing="off" w:after="0" w:afterAutospacing="off"/>
+              <w:jc w:val="left"/>
+              <w:rPr>
+                <w:rFonts w:ascii="Trebuchet MS" w:hAnsi="Trebuchet MS" w:eastAsia="Trebuchet MS" w:cs="Trebuchet MS"/>
+              </w:rPr>
+            </w:pPr>
+            <w:r>
+              <w:rPr>
+                <w:rFonts w:ascii="Trebuchet MS" w:hAnsi="Trebuchet MS" w:eastAsia="Trebuchet MS" w:cs="Trebuchet MS"/>
+              </w:rPr>
+              <w:t>STORE_ZONE_NAME</w:t>
+            </w:r>
+          </w:p>
+        </w:tc>
+        <w:tc>
+          <w:tcPr>
+            <w:tcW w:w="3330" w:type="dxa"/>
+            <w:tcMar/>
+          </w:tcPr>
+          <w:p>
+            <w:pPr>
+              <w:spacing w:before="0" w:beforeAutospacing="off" w:after="0" w:afterAutospacing="off"/>
+              <w:jc w:val="left"/>
+              <w:rPr>
+                <w:rFonts w:ascii="Trebuchet MS" w:hAnsi="Trebuchet MS" w:eastAsia="Trebuchet MS" w:cs="Trebuchet MS"/>
+              </w:rPr>
+            </w:pPr>
+            <w:r>
+              <w:rPr>
+                <w:rFonts w:ascii="Trebuchet MS" w:hAnsi="Trebuchet MS" w:eastAsia="Trebuchet MS" w:cs="Trebuchet MS"/>
+              </w:rPr>
+              <w:t>VARCHAR(50) NOT NULL</w:t>
+            </w:r>
+          </w:p>
+        </w:tc>
+        <w:tc>
+          <w:tcPr>
+            <w:tcW w:w="2790" w:type="dxa"/>
+            <w:tcMar/>
+          </w:tcPr>
+          <w:p>
+            <w:pPr>
+              <w:spacing w:before="0" w:beforeAutospacing="off" w:after="0" w:afterAutospacing="off"/>
+              <w:jc w:val="left"/>
+              <w:rPr>
+                <w:rFonts w:ascii="Trebuchet MS" w:hAnsi="Trebuchet MS" w:eastAsia="Trebuchet MS" w:cs="Trebuchet MS"/>
+              </w:rPr>
+            </w:pPr>
+            <w:r>
+              <w:rPr>
+                <w:rFonts w:ascii="Trebuchet MS" w:hAnsi="Trebuchet MS" w:eastAsia="Trebuchet MS" w:cs="Trebuchet MS"/>
+              </w:rPr>
+              <w:t>North / South / East / West / N/A</w:t>
+            </w:r>
+          </w:p>
+        </w:tc>
+      </w:tr>
+      <w:tr>
+        <w:trPr>
+          <w:trHeight w:val="432"/>
+        </w:trPr>
+        <w:tc>
+          <w:tcPr>
+            <w:tcW w:w="3073" w:type="dxa"/>
+            <w:tcMar/>
+          </w:tcPr>
+          <w:p>
+            <w:pPr>
+              <w:spacing w:before="0" w:beforeAutospacing="off" w:after="0" w:afterAutospacing="off"/>
+              <w:jc w:val="left"/>
+              <w:rPr>
+                <w:rFonts w:ascii="Trebuchet MS" w:hAnsi="Trebuchet MS" w:eastAsia="Trebuchet MS" w:cs="Trebuchet MS"/>
+              </w:rPr>
+            </w:pPr>
+            <w:r>
+              <w:rPr>
+                <w:rFonts w:ascii="Trebuchet MS" w:hAnsi="Trebuchet MS" w:eastAsia="Trebuchet MS" w:cs="Trebuchet MS"/>
+              </w:rPr>
+              <w:t>TA_INSERT_DT</w:t>
+            </w:r>
+          </w:p>
+        </w:tc>
+        <w:tc>
+          <w:tcPr>
+            <w:tcW w:w="3330" w:type="dxa"/>
+            <w:tcMar/>
+          </w:tcPr>
+          <w:p>
+            <w:pPr>
+              <w:spacing w:before="0" w:beforeAutospacing="off" w:after="0" w:afterAutospacing="off"/>
+              <w:jc w:val="left"/>
+              <w:rPr>
+                <w:rFonts w:ascii="Trebuchet MS" w:hAnsi="Trebuchet MS" w:eastAsia="Trebuchet MS" w:cs="Trebuchet MS"/>
+              </w:rPr>
+            </w:pPr>
+            <w:r>
+              <w:rPr>
+                <w:rFonts w:ascii="Trebuchet MS" w:hAnsi="Trebuchet MS" w:eastAsia="Trebuchet MS" w:cs="Trebuchet MS"/>
+              </w:rPr>
+              <w:t>DATE NOT NULL</w:t>
+            </w:r>
+          </w:p>
+        </w:tc>
+        <w:tc>
+          <w:tcPr>
+            <w:tcW w:w="2790" w:type="dxa"/>
+            <w:tcMar/>
+          </w:tcPr>
+          <w:p>
+            <w:pPr>
+              <w:spacing w:before="0" w:beforeAutospacing="off" w:after="0" w:afterAutospacing="off"/>
+              <w:jc w:val="left"/>
+              <w:rPr>
+                <w:rFonts w:ascii="Trebuchet MS" w:hAnsi="Trebuchet MS" w:eastAsia="Trebuchet MS" w:cs="Trebuchet MS"/>
+              </w:rPr>
+            </w:pPr>
+            <w:r>
+              <w:rPr>
+                <w:rFonts w:ascii="Trebuchet MS" w:hAnsi="Trebuchet MS" w:eastAsia="Trebuchet MS" w:cs="Trebuchet MS"/>
+              </w:rPr>
+              <w:t>Row creation date</w:t>
+            </w:r>
+          </w:p>
+        </w:tc>
+      </w:tr>
+      <w:tr>
+        <w:trPr>
+          <w:trHeight w:val="432"/>
+        </w:trPr>
+        <w:tc>
+          <w:tcPr>
+            <w:tcW w:w="3073" w:type="dxa"/>
+            <w:tcMar/>
+          </w:tcPr>
+          <w:p>
+            <w:pPr>
+              <w:spacing w:before="0" w:beforeAutospacing="off" w:after="0" w:afterAutospacing="off"/>
+              <w:jc w:val="left"/>
+              <w:rPr>
+                <w:rFonts w:ascii="Trebuchet MS" w:hAnsi="Trebuchet MS" w:eastAsia="Trebuchet MS" w:cs="Trebuchet MS"/>
+              </w:rPr>
+            </w:pPr>
+            <w:r>
+              <w:rPr>
+                <w:rFonts w:ascii="Trebuchet MS" w:hAnsi="Trebuchet MS" w:eastAsia="Trebuchet MS" w:cs="Trebuchet MS"/>
+              </w:rPr>
+              <w:t>SOURCE_SYSTEM</w:t>
+            </w:r>
+          </w:p>
+        </w:tc>
+        <w:tc>
+          <w:tcPr>
+            <w:tcW w:w="3330" w:type="dxa"/>
+            <w:tcMar/>
+          </w:tcPr>
+          <w:p>
+            <w:pPr>
+              <w:spacing w:before="0" w:beforeAutospacing="off" w:after="0" w:afterAutospacing="off"/>
+              <w:jc w:val="left"/>
+              <w:rPr>
+                <w:rFonts w:ascii="Trebuchet MS" w:hAnsi="Trebuchet MS" w:eastAsia="Trebuchet MS" w:cs="Trebuchet MS"/>
+              </w:rPr>
+            </w:pPr>
+            <w:r>
+              <w:rPr>
+                <w:rFonts w:ascii="Trebuchet MS" w:hAnsi="Trebuchet MS" w:eastAsia="Trebuchet MS" w:cs="Trebuchet MS"/>
+              </w:rPr>
+              <w:t>VARCHAR(50) NOT NULL</w:t>
+            </w:r>
+          </w:p>
+        </w:tc>
+        <w:tc>
+          <w:tcPr>
+            <w:tcW w:w="2790" w:type="dxa"/>
+            <w:tcMar/>
+          </w:tcPr>
+          <w:p>
+            <w:pPr>
+              <w:spacing w:before="0" w:beforeAutospacing="off" w:after="0" w:afterAutospacing="off"/>
+              <w:jc w:val="left"/>
+              <w:rPr>
+                <w:rFonts w:ascii="Trebuchet MS" w:hAnsi="Trebuchet MS" w:eastAsia="Trebuchet MS" w:cs="Trebuchet MS"/>
+              </w:rPr>
+            </w:pPr>
+            <w:r>
+              <w:rPr>
+                <w:rFonts w:ascii="Trebuchet MS" w:hAnsi="Trebuchet MS" w:eastAsia="Trebuchet MS" w:cs="Trebuchet MS"/>
+              </w:rPr>
+              <w:t>'MANUAL'</w:t>
+            </w:r>
+          </w:p>
+        </w:tc>
+      </w:tr>
+      <w:tr>
+        <w:trPr>
+          <w:trHeight w:val="432"/>
+        </w:trPr>
+        <w:tc>
+          <w:tcPr>
+            <w:tcW w:w="3073" w:type="dxa"/>
+            <w:tcMar/>
+          </w:tcPr>
+          <w:p>
+            <w:pPr>
+              <w:spacing w:before="0" w:beforeAutospacing="off" w:after="0" w:afterAutospacing="off"/>
+              <w:jc w:val="left"/>
+              <w:rPr>
+                <w:rFonts w:ascii="Trebuchet MS" w:hAnsi="Trebuchet MS" w:eastAsia="Trebuchet MS" w:cs="Trebuchet MS"/>
+              </w:rPr>
+            </w:pPr>
+            <w:r>
+              <w:rPr>
+                <w:rFonts w:ascii="Trebuchet MS" w:hAnsi="Trebuchet MS" w:eastAsia="Trebuchet MS" w:cs="Trebuchet MS"/>
+              </w:rPr>
+              <w:t>SOURCE_ENTITY</w:t>
+            </w:r>
+          </w:p>
+        </w:tc>
+        <w:tc>
+          <w:tcPr>
+            <w:tcW w:w="3330" w:type="dxa"/>
+            <w:tcMar/>
+          </w:tcPr>
+          <w:p>
+            <w:pPr>
+              <w:spacing w:before="0" w:beforeAutospacing="off" w:after="0" w:afterAutospacing="off"/>
+              <w:jc w:val="left"/>
+              <w:rPr>
+                <w:rFonts w:ascii="Trebuchet MS" w:hAnsi="Trebuchet MS" w:eastAsia="Trebuchet MS" w:cs="Trebuchet MS"/>
+              </w:rPr>
+            </w:pPr>
+            <w:r>
+              <w:rPr>
+                <w:rFonts w:ascii="Trebuchet MS" w:hAnsi="Trebuchet MS" w:eastAsia="Trebuchet MS" w:cs="Trebuchet MS"/>
+              </w:rPr>
+              <w:t>VARCHAR(50) NOT NULL</w:t>
+            </w:r>
+          </w:p>
+        </w:tc>
+        <w:tc>
+          <w:tcPr>
+            <w:tcW w:w="2790" w:type="dxa"/>
+            <w:tcMar/>
+          </w:tcPr>
+          <w:p>
+            <w:pPr>
+              <w:spacing w:before="0" w:beforeAutospacing="off" w:after="0" w:afterAutospacing="off"/>
+              <w:jc w:val="left"/>
+              <w:rPr>
+                <w:rFonts w:ascii="Trebuchet MS" w:hAnsi="Trebuchet MS" w:eastAsia="Trebuchet MS" w:cs="Trebuchet MS"/>
+              </w:rPr>
+            </w:pPr>
+            <w:r>
+              <w:rPr>
+                <w:rFonts w:ascii="Trebuchet MS" w:hAnsi="Trebuchet MS" w:eastAsia="Trebuchet MS" w:cs="Trebuchet MS"/>
+              </w:rPr>
+              <w:t>'MANUAL'</w:t>
+            </w:r>
+          </w:p>
+        </w:tc>
+      </w:tr>
+    </w:tbl>
+    <w:p>
+      <w:pPr>
+        <w:pStyle w:val="BodyText"/>
+      </w:pPr>
+    </w:p>
+    <w:p>
+      <w:pPr>
         <w:pStyle w:val="Heading2"/>
         <w:rPr/>
       </w:pPr>
@@ -23218,10 +24268,10 @@
       </w:pPr>
       <w:r>
         <w:drawing>
-          <wp:inline wp14:editId="73C6E7AB" wp14:anchorId="2496C3C9">
-            <wp:extent cx="6305550" cy="5724525"/>
+          <wp:inline wp14:editId="46BBCAE9" wp14:anchorId="7DF77436">
+            <wp:extent cx="6305550" cy="6200775"/>
             <wp:effectExtent l="0" t="0" r="0" b="0"/>
-            <wp:docPr id="1738619295" name="drawing"/>
+            <wp:docPr id="431230276" name="drawing"/>
             <wp:cNvGraphicFramePr>
               <a:graphicFrameLocks noChangeAspect="1"/>
             </wp:cNvGraphicFramePr>
@@ -23229,11 +24279,11 @@
               <a:graphicData xmlns:a="http://schemas.openxmlformats.org/drawingml/2006/main" uri="http://schemas.openxmlformats.org/drawingml/2006/picture">
                 <pic:pic xmlns:pic="http://schemas.openxmlformats.org/drawingml/2006/picture">
                   <pic:nvPicPr>
-                    <pic:cNvPr id="1738619295" name="Picture 1738619295"/>
+                    <pic:cNvPr id="431230276" name="Picture 431230276"/>
                     <pic:cNvPicPr/>
                   </pic:nvPicPr>
                   <pic:blipFill>
-                    <a:blip xmlns:r="http://schemas.openxmlformats.org/officeDocument/2006/relationships" r:embed="rId1407784030">
+                    <a:blip xmlns:r="http://schemas.openxmlformats.org/officeDocument/2006/relationships" r:embed="rId937612466">
                       <a:extLst>
                         <a:ext uri="{28A0092B-C50C-407E-A947-70E740481C1C}">
                           <a14:useLocalDpi xmlns:a14="http://schemas.microsoft.com/office/drawing/2010/main"/>
@@ -23247,7 +24297,7 @@
                   <pic:spPr>
                     <a:xfrm>
                       <a:off x="0" y="0"/>
-                      <a:ext cx="6305550" cy="5724525"/>
+                      <a:ext cx="6305550" cy="6200775"/>
                     </a:xfrm>
                     <a:prstGeom prst="rect">
                       <a:avLst/>

</xml_diff>